<commit_message>
İST268 İst yönt proje ödevinde bir kaç değişiklik yapıldı.
</commit_message>
<xml_diff>
--- a/İST268-1 İstatiksel Yöntemler I/Proje Ödevi/İST268-ist-yönt-odev.docx
+++ b/İST268-1 İstatiksel Yöntemler I/Proje Ödevi/İST268-ist-yönt-odev.docx
@@ -142,67 +142,7 @@
           <w:sz w:val="28"/>
           <w:szCs w:val="28"/>
         </w:rPr>
-        <w:t xml:space="preserve">İki Örneklem Hipotez Testleri (Hipotez Testleri, Güven Aralığı, Bağımlı </w:t>
-      </w:r>
-      <w:r>
-        <w:rPr>
-          <w:rFonts w:eastAsia="Times New Roman" w:cs="Times New Roman" w:ascii="Liberation Serif" w:hAnsi="Liberation Serif" w:cstheme="minorAscii" w:eastAsiaTheme="minorAscii"/>
-          <w:b w:val="false"/>
-          <w:bCs w:val="false"/>
-          <w:sz w:val="28"/>
-          <w:szCs w:val="28"/>
-        </w:rPr>
-        <w:t>İki</w:t>
-      </w:r>
-      <w:r>
-        <w:rPr>
-          <w:rFonts w:eastAsia="Times New Roman" w:cs="Times New Roman" w:ascii="Liberation Serif" w:hAnsi="Liberation Serif" w:cstheme="minorAscii" w:eastAsiaTheme="minorAscii"/>
-          <w:b w:val="false"/>
-          <w:bCs w:val="false"/>
-          <w:sz w:val="28"/>
-          <w:szCs w:val="28"/>
-        </w:rPr>
-        <w:t xml:space="preserve"> </w:t>
-      </w:r>
-      <w:r>
-        <w:rPr>
-          <w:rFonts w:eastAsia="Times New Roman" w:cs="Times New Roman" w:ascii="Liberation Serif" w:hAnsi="Liberation Serif" w:cstheme="minorAscii" w:eastAsiaTheme="minorAscii"/>
-          <w:b w:val="false"/>
-          <w:bCs w:val="false"/>
-          <w:sz w:val="28"/>
-          <w:szCs w:val="28"/>
-        </w:rPr>
-        <w:t>Ö</w:t>
-      </w:r>
-      <w:r>
-        <w:rPr>
-          <w:rFonts w:eastAsia="Times New Roman" w:cs="Times New Roman" w:ascii="Liberation Serif" w:hAnsi="Liberation Serif" w:cstheme="minorAscii" w:eastAsiaTheme="minorAscii"/>
-          <w:b w:val="false"/>
-          <w:bCs w:val="false"/>
-          <w:sz w:val="28"/>
-          <w:szCs w:val="28"/>
-        </w:rPr>
-        <w:t xml:space="preserve">rneklem </w:t>
-      </w:r>
-      <w:r>
-        <w:rPr>
-          <w:rFonts w:eastAsia="Times New Roman" w:cs="Times New Roman" w:ascii="Liberation Serif" w:hAnsi="Liberation Serif" w:cstheme="minorAscii" w:eastAsiaTheme="minorAscii"/>
-          <w:b w:val="false"/>
-          <w:bCs w:val="false"/>
-          <w:sz w:val="28"/>
-          <w:szCs w:val="28"/>
-        </w:rPr>
-        <w:t>İ</w:t>
-      </w:r>
-      <w:r>
-        <w:rPr>
-          <w:rFonts w:eastAsia="Times New Roman" w:cs="Times New Roman" w:ascii="Liberation Serif" w:hAnsi="Liberation Serif" w:cstheme="minorAscii" w:eastAsiaTheme="minorAscii"/>
-          <w:b w:val="false"/>
-          <w:bCs w:val="false"/>
-          <w:sz w:val="28"/>
-          <w:szCs w:val="28"/>
-        </w:rPr>
-        <w:t>ncelenmesi) ve Ki-Kare Çözümlemeleri (Uyum İyiliği Testi, Gruplar Arası Fark ve Bağımsızlık Kontrolü)</w:t>
+        <w:t>İki Örneklem Hipotez Testleri (Hipotez Testleri, Güven Aralığı, Bağımlı İki Örneklem İncelenmesi) ve Ki-Kare Çözümlemeleri (Uyum İyiliği Testi, Gruplar Arası Fark ve Bağımsızlık Kontrolü)</w:t>
       </w:r>
     </w:p>
     <w:p>
@@ -279,6 +219,10 @@
     <w:p>
       <w:pPr>
         <w:pStyle w:val="Heading2"/>
+        <w:numPr>
+          <w:ilvl w:val="1"/>
+          <w:numId w:val="2"/>
+        </w:numPr>
         <w:ind w:hanging="0" w:start="0"/>
         <w:rPr>
           <w:rFonts w:ascii="Liberation Serif" w:hAnsi="Liberation Serif"/>
@@ -311,23 +255,21 @@
     </w:p>
     <w:p>
       <w:pPr>
-        <w:pStyle w:val="Heading1"/>
-        <w:rPr/>
-      </w:pPr>
-      <w:r>
-        <w:rPr>
-          <w:rStyle w:val="Heading2Char"/>
-          <w:rFonts w:ascii="Liberation Serif" w:hAnsi="Liberation Serif"/>
-          <w:sz w:val="40"/>
-          <w:szCs w:val="40"/>
-        </w:rPr>
-        <w:t>1. İki Örneklem Analizleri</w:t>
-      </w:r>
-      <w:r>
-        <w:rPr>
-          <w:rFonts w:ascii="Liberation Serif" w:hAnsi="Liberation Serif"/>
-        </w:rPr>
-        <w:tab/>
+        <w:pStyle w:val="Heading3"/>
+        <w:numPr>
+          <w:ilvl w:val="2"/>
+          <w:numId w:val="2"/>
+        </w:numPr>
+        <w:ind w:hanging="0" w:start="0"/>
+        <w:rPr>
+          <w:rFonts w:ascii="Liberation Serif" w:hAnsi="Liberation Serif"/>
+        </w:rPr>
+      </w:pPr>
+      <w:r>
+        <w:rPr>
+          <w:rFonts w:ascii="Liberation Serif" w:hAnsi="Liberation Serif"/>
+        </w:rPr>
+        <w:t>Kullanılacak Veri Setleri:</w:t>
       </w:r>
     </w:p>
     <w:p>
@@ -346,40 +288,6 @@
           <w:bCs w:val="false"/>
         </w:rPr>
         <w:tab/>
-        <w:t>Bu başlık altında veri setleri üzerinde iki örneklem; hipotez testlerini, güven aralıklarını ve verilerin basit istatistikleri elde edilerek yorumlanacaktır.</w:t>
-      </w:r>
-    </w:p>
-    <w:p>
-      <w:pPr>
-        <w:pStyle w:val="Heading3"/>
-        <w:ind w:hanging="0" w:start="0"/>
-        <w:rPr>
-          <w:rFonts w:ascii="Liberation Serif" w:hAnsi="Liberation Serif"/>
-        </w:rPr>
-      </w:pPr>
-      <w:r>
-        <w:rPr>
-          <w:rFonts w:ascii="Liberation Serif" w:hAnsi="Liberation Serif"/>
-        </w:rPr>
-        <w:t>Kullanılacak Veri Setleri:</w:t>
-      </w:r>
-    </w:p>
-    <w:p>
-      <w:pPr>
-        <w:pStyle w:val="Normal"/>
-        <w:spacing w:lineRule="auto" w:line="240"/>
-        <w:ind w:hanging="0" w:start="0"/>
-        <w:rPr>
-          <w:rFonts w:ascii="Liberation Serif" w:hAnsi="Liberation Serif"/>
-        </w:rPr>
-      </w:pPr>
-      <w:r>
-        <w:rPr>
-          <w:rFonts w:eastAsia="Times New Roman" w:cs="Times New Roman" w:ascii="Liberation Serif" w:hAnsi="Liberation Serif" w:cstheme="minorAscii" w:eastAsiaTheme="minorAscii"/>
-          <w:b w:val="false"/>
-          <w:bCs w:val="false"/>
-        </w:rPr>
-        <w:tab/>
         <w:t xml:space="preserve">Bu analiz için R’da </w:t>
       </w:r>
       <w:r>
@@ -488,6 +396,10 @@
     <w:p>
       <w:pPr>
         <w:pStyle w:val="Heading3"/>
+        <w:numPr>
+          <w:ilvl w:val="2"/>
+          <w:numId w:val="2"/>
+        </w:numPr>
         <w:ind w:hanging="0" w:start="0"/>
         <w:rPr>
           <w:rFonts w:ascii="Liberation Serif" w:hAnsi="Liberation Serif"/>
@@ -750,6 +662,10 @@
     <w:p>
       <w:pPr>
         <w:pStyle w:val="Heading3"/>
+        <w:numPr>
+          <w:ilvl w:val="2"/>
+          <w:numId w:val="2"/>
+        </w:numPr>
         <w:ind w:hanging="0" w:start="0"/>
         <w:rPr>
           <w:rFonts w:ascii="Liberation Serif" w:hAnsi="Liberation Serif"/>
@@ -774,7 +690,12 @@
         <w:spacing w:lineRule="auto" w:line="240"/>
         <w:ind w:hanging="0"/>
         <w:rPr>
-          <w:rFonts w:ascii="Liberation Serif" w:hAnsi="Liberation Serif" w:eastAsia="Times New Roman" w:cs="Times New Roman" w:cstheme="minorAscii" w:eastAsiaTheme="minorAscii"/>
+          <w:rFonts w:ascii="Liberation Serif" w:hAnsi="Liberation Serif"/>
+        </w:rPr>
+      </w:pPr>
+      <w:r>
+        <w:rPr>
+          <w:rFonts w:eastAsia="Times New Roman" w:cs="Times New Roman" w:ascii="Liberation Serif" w:hAnsi="Liberation Serif" w:cstheme="minorAscii" w:eastAsiaTheme="minorAscii"/>
           <w:b w:val="false"/>
           <w:bCs w:val="false"/>
           <w:i w:val="false"/>
@@ -785,10 +706,22 @@
           <w:szCs w:val="24"/>
           <w:lang w:val="en-US"/>
         </w:rPr>
-      </w:pPr>
-      <w:r>
-        <w:rPr>
-          <w:rFonts w:eastAsia="Times New Roman" w:cs="Times New Roman" w:cstheme="minorAscii" w:eastAsiaTheme="minorAscii" w:ascii="Liberation Serif" w:hAnsi="Liberation Serif"/>
+        <w:tab/>
+        <w:t xml:space="preserve">“Titanic” veri seti Titanic gemisindeki her bir yolcunun sınıfı, cinsiyeti, yaşı ve hayatta kalma durumunu kaydeden bir veri seti sunmaktadır. Veri 4 kategori altında yapılandırılmıştır. </w:t>
+      </w:r>
+    </w:p>
+    <w:p>
+      <w:pPr>
+        <w:pStyle w:val="Normal"/>
+        <w:spacing w:lineRule="auto" w:line="240"/>
+        <w:ind w:hanging="0"/>
+        <w:rPr>
+          <w:rFonts w:ascii="Liberation Serif" w:hAnsi="Liberation Serif"/>
+        </w:rPr>
+      </w:pPr>
+      <w:r>
+        <w:rPr>
+          <w:rFonts w:eastAsia="Times New Roman" w:cs="Times New Roman" w:ascii="Liberation Serif" w:hAnsi="Liberation Serif" w:cstheme="minorAscii" w:eastAsiaTheme="minorAscii"/>
           <w:b w:val="false"/>
           <w:bCs w:val="false"/>
           <w:i w:val="false"/>
@@ -799,72 +732,7 @@
           <w:szCs w:val="24"/>
           <w:lang w:val="en-US"/>
         </w:rPr>
-        <w:tab/>
-        <w:t xml:space="preserve">“Titanic” veri seti Titanic gemisindeki her bir yolcunun sınıfı, cinsiyeti, yaşı ve hayatta kalma durumunu kaydeden bir veri seti sunmaktadır. </w:t>
-      </w:r>
-      <w:r>
-        <w:rPr>
-          <w:rFonts w:eastAsia="Times New Roman" w:cs="Times New Roman" w:cstheme="minorAscii" w:eastAsiaTheme="minorAscii" w:ascii="Liberation Serif" w:hAnsi="Liberation Serif"/>
-          <w:b w:val="false"/>
-          <w:bCs w:val="false"/>
-          <w:i w:val="false"/>
-          <w:iCs w:val="false"/>
-          <w:caps w:val="false"/>
-          <w:smallCaps w:val="false"/>
-          <w:sz w:val="24"/>
-          <w:szCs w:val="24"/>
-          <w:lang w:val="en-US"/>
-        </w:rPr>
-        <w:t xml:space="preserve">Veri 4 kategori altında yapılandırılmıştır. </w:t>
-      </w:r>
-    </w:p>
-    <w:p>
-      <w:pPr>
-        <w:pStyle w:val="Normal"/>
-        <w:spacing w:lineRule="auto" w:line="240"/>
-        <w:ind w:hanging="0"/>
-        <w:rPr>
-          <w:rFonts w:ascii="Liberation Serif" w:hAnsi="Liberation Serif" w:eastAsia="Times New Roman" w:cs="Times New Roman" w:cstheme="minorAscii" w:eastAsiaTheme="minorAscii"/>
-          <w:b w:val="false"/>
-          <w:bCs w:val="false"/>
-          <w:i w:val="false"/>
-          <w:iCs w:val="false"/>
-          <w:caps w:val="false"/>
-          <w:smallCaps w:val="false"/>
-          <w:sz w:val="24"/>
-          <w:szCs w:val="24"/>
-          <w:lang w:val="en-US"/>
-        </w:rPr>
-      </w:pPr>
-      <w:r>
-        <w:rPr>
-          <w:rFonts w:eastAsia="Times New Roman" w:cs="Times New Roman" w:cstheme="minorAscii" w:eastAsiaTheme="minorAscii" w:ascii="Liberation Serif" w:hAnsi="Liberation Serif"/>
-          <w:b w:val="false"/>
-          <w:bCs w:val="false"/>
-          <w:i w:val="false"/>
-          <w:iCs w:val="false"/>
-          <w:caps w:val="false"/>
-          <w:smallCaps w:val="false"/>
-          <w:sz w:val="24"/>
-          <w:szCs w:val="24"/>
-          <w:lang w:val="en-US"/>
-        </w:rPr>
-        <w:t>B</w:t>
-      </w:r>
-      <w:r>
-        <w:rPr>
-          <w:rFonts w:eastAsia="Times New Roman" w:cs="Times New Roman" w:cstheme="minorAscii" w:eastAsiaTheme="minorAscii" w:ascii="Liberation Serif" w:hAnsi="Liberation Serif"/>
-          <w:b w:val="false"/>
-          <w:bCs w:val="false"/>
-          <w:i w:val="false"/>
-          <w:iCs w:val="false"/>
-          <w:caps w:val="false"/>
-          <w:smallCaps w:val="false"/>
-          <w:sz w:val="24"/>
-          <w:szCs w:val="24"/>
-          <w:lang w:val="en-US"/>
-        </w:rPr>
-        <w:t xml:space="preserve">u veri, aslen İngiliz Ticaret Bakanlığı tarafından toplanmış ve şu eserde yeniden basılmış verilere dayanmaktadır: </w:t>
+        <w:t xml:space="preserve">Bu veri, aslen İngiliz Ticaret Bakanlığı tarafından toplanmış ve şu eserde yeniden basılmış verilere dayanmaktadır: </w:t>
       </w:r>
     </w:p>
     <w:p>
@@ -976,6 +844,10 @@
     <w:p>
       <w:pPr>
         <w:pStyle w:val="Heading3"/>
+        <w:numPr>
+          <w:ilvl w:val="2"/>
+          <w:numId w:val="2"/>
+        </w:numPr>
         <w:ind w:hanging="0" w:start="0"/>
         <w:rPr>
           <w:rFonts w:ascii="Liberation Serif" w:hAnsi="Liberation Serif"/>
@@ -1000,7 +872,12 @@
         <w:spacing w:lineRule="auto" w:line="240"/>
         <w:ind w:hanging="0"/>
         <w:rPr>
-          <w:rFonts w:ascii="Liberation Serif" w:hAnsi="Liberation Serif" w:eastAsia="Times New Roman" w:cs="Times New Roman" w:cstheme="minorAscii" w:eastAsiaTheme="minorAscii"/>
+          <w:rFonts w:ascii="Liberation Serif" w:hAnsi="Liberation Serif"/>
+        </w:rPr>
+      </w:pPr>
+      <w:r>
+        <w:rPr>
+          <w:rFonts w:eastAsia="Times New Roman" w:cs="Times New Roman" w:ascii="Liberation Serif" w:hAnsi="Liberation Serif" w:cstheme="minorAscii" w:eastAsiaTheme="minorAscii"/>
           <w:b w:val="false"/>
           <w:bCs w:val="false"/>
           <w:i w:val="false"/>
@@ -1011,10 +888,11 @@
           <w:szCs w:val="24"/>
           <w:lang w:val="en-US"/>
         </w:rPr>
-      </w:pPr>
-      <w:r>
-        <w:rPr>
-          <w:rFonts w:eastAsia="Times New Roman" w:cs="Times New Roman" w:cstheme="minorAscii" w:eastAsiaTheme="minorAscii" w:ascii="Liberation Serif" w:hAnsi="Liberation Serif"/>
+        <w:t>“</w:t>
+      </w:r>
+      <w:r>
+        <w:rPr>
+          <w:rFonts w:eastAsia="Times New Roman" w:cs="Times New Roman" w:ascii="Liberation Serif" w:hAnsi="Liberation Serif" w:cstheme="minorAscii" w:eastAsiaTheme="minorAscii"/>
           <w:b w:val="false"/>
           <w:bCs w:val="false"/>
           <w:i w:val="false"/>
@@ -1025,100 +903,102 @@
           <w:szCs w:val="24"/>
           <w:lang w:val="en-US"/>
         </w:rPr>
-        <w:t>“</w:t>
-      </w:r>
-      <w:r>
-        <w:rPr>
-          <w:rFonts w:eastAsia="Times New Roman" w:cs="Times New Roman" w:cstheme="minorAscii" w:eastAsiaTheme="minorAscii" w:ascii="Liberation Serif" w:hAnsi="Liberation Serif"/>
-          <w:b w:val="false"/>
-          <w:bCs w:val="false"/>
-          <w:i w:val="false"/>
-          <w:iCs w:val="false"/>
-          <w:caps w:val="false"/>
-          <w:smallCaps w:val="false"/>
-          <w:sz w:val="24"/>
-          <w:szCs w:val="24"/>
-          <w:lang w:val="en-US"/>
-        </w:rPr>
-        <w:t xml:space="preserve">sleep” veri seti 2 grup öğrenci denek arasında yapılan 2 ilacın uyku sürelerine etkisi üzerine bilgi </w:t>
-      </w:r>
-      <w:r>
-        <w:rPr>
-          <w:rFonts w:eastAsia="Times New Roman" w:cs="Times New Roman" w:cstheme="minorAscii" w:eastAsiaTheme="minorAscii" w:ascii="Liberation Serif" w:hAnsi="Liberation Serif"/>
-          <w:b w:val="false"/>
-          <w:bCs w:val="false"/>
-          <w:i w:val="false"/>
-          <w:iCs w:val="false"/>
-          <w:caps w:val="false"/>
-          <w:smallCaps w:val="false"/>
-          <w:sz w:val="24"/>
-          <w:szCs w:val="24"/>
-          <w:lang w:val="en-US"/>
-        </w:rPr>
-        <w:t>içermektedir</w:t>
-      </w:r>
-      <w:r>
-        <w:rPr>
-          <w:rFonts w:eastAsia="Times New Roman" w:cs="Times New Roman" w:cstheme="minorAscii" w:eastAsiaTheme="minorAscii" w:ascii="Liberation Serif" w:hAnsi="Liberation Serif"/>
-          <w:b w:val="false"/>
-          <w:bCs w:val="false"/>
-          <w:i w:val="false"/>
-          <w:iCs w:val="false"/>
-          <w:caps w:val="false"/>
-          <w:smallCaps w:val="false"/>
-          <w:sz w:val="24"/>
-          <w:szCs w:val="24"/>
-          <w:lang w:val="en-US"/>
-        </w:rPr>
-        <w:t xml:space="preserve">. </w:t>
-      </w:r>
-      <w:r>
-        <w:rPr>
-          <w:rFonts w:eastAsia="Times New Roman" w:cs="Times New Roman" w:cstheme="minorAscii" w:eastAsiaTheme="minorAscii" w:ascii="Liberation Serif" w:hAnsi="Liberation Serif"/>
-          <w:b w:val="false"/>
-          <w:bCs w:val="false"/>
-          <w:i w:val="false"/>
-          <w:iCs w:val="false"/>
-          <w:caps w:val="false"/>
-          <w:smallCaps w:val="false"/>
-          <w:sz w:val="24"/>
-          <w:szCs w:val="24"/>
-          <w:lang w:val="en-US"/>
-        </w:rPr>
-        <w:t>3 değişken barındırmaktadır ve bunlar sırasıyla “d”, “group”, “ID”. “d” ilaç verildikten sonra öğrencilerde meydana gelen uyku sürelerindeki artış miktarıdır yani farkıdır (sonra – önce). “group” 2 gruba ayrılan öğrenci gruplarını temsil eder ve gruplar “1” ve “2” değerleri ile ayrıştırılmıştır. “ID” değişkeni ise verilerin, öğrencilerin sırasıyla numaralandırılarak eşlenmesi sağlanmıştır.</w:t>
+        <w:t>sleep” veri seti 2 grup öğrenci denek arasında yapılan 2 ilacın uyku sürelerine etkisi üzerine bilgi içermektedir. 3 değişken barındırmaktadır ve bunlar sırasıyla “d”, “group”, “ID”. “d” ilaç verildikten sonra öğrencilerde meydana gelen uyku sürelerindeki artış miktarıdır yani farkıdır (sonra – önce). “group” 2 gruba ayrılan öğrenci gruplarını temsil eder ve gruplar “1” ve “2” değerleri ile ayrıştırılmıştır. “ID” değişkeni ise verilerin, öğrencilerin sırasıyla numaralandırılarak eşlenmesi sağlanmıştır.</w:t>
+      </w:r>
+    </w:p>
+    <w:p>
+      <w:pPr>
+        <w:pStyle w:val="Heading1"/>
+        <w:rPr/>
+      </w:pPr>
+      <w:r>
+        <w:rPr>
+          <w:rStyle w:val="Heading2Char"/>
+          <w:rFonts w:ascii="Liberation Serif" w:hAnsi="Liberation Serif"/>
+          <w:sz w:val="40"/>
+          <w:szCs w:val="40"/>
+        </w:rPr>
+        <w:t>1. İki Örneklem Analizleri</w:t>
+      </w:r>
+      <w:r>
+        <w:rPr>
+          <w:rFonts w:ascii="Liberation Serif" w:hAnsi="Liberation Serif"/>
+        </w:rPr>
+        <w:tab/>
       </w:r>
     </w:p>
     <w:p>
       <w:pPr>
         <w:pStyle w:val="Normal"/>
         <w:spacing w:lineRule="auto" w:line="240"/>
-        <w:ind w:hanging="0"/>
-        <w:rPr>
-          <w:rFonts w:ascii="Liberation Serif" w:hAnsi="Liberation Serif" w:eastAsia="Times New Roman" w:cs="Times New Roman" w:cstheme="minorAscii" w:eastAsiaTheme="minorAscii"/>
-          <w:b w:val="false"/>
-          <w:bCs w:val="false"/>
-          <w:i w:val="false"/>
-          <w:iCs w:val="false"/>
-          <w:caps w:val="false"/>
-          <w:smallCaps w:val="false"/>
-          <w:sz w:val="24"/>
-          <w:szCs w:val="24"/>
-          <w:lang w:val="en-US"/>
-        </w:rPr>
-      </w:pPr>
-      <w:r>
-        <w:rPr>
-          <w:rFonts w:eastAsia="Times New Roman" w:cs="Times New Roman" w:cstheme="minorAscii" w:eastAsiaTheme="minorAscii" w:ascii="Liberation Serif" w:hAnsi="Liberation Serif"/>
-          <w:b w:val="false"/>
-          <w:bCs w:val="false"/>
-          <w:i w:val="false"/>
-          <w:iCs w:val="false"/>
-          <w:caps w:val="false"/>
-          <w:smallCaps w:val="false"/>
-          <w:sz w:val="24"/>
-          <w:szCs w:val="24"/>
-          <w:lang w:val="en-US"/>
-        </w:rPr>
+        <w:ind w:hanging="0" w:start="0"/>
+        <w:rPr>
+          <w:rFonts w:ascii="Liberation Serif" w:hAnsi="Liberation Serif"/>
+        </w:rPr>
+      </w:pPr>
+      <w:r>
+        <w:rPr>
+          <w:rFonts w:ascii="Liberation Serif" w:hAnsi="Liberation Serif"/>
+        </w:rPr>
+        <w:tab/>
+        <w:t>Bu başlık altında veri setleri üzerinde iki örneklem; hipotez testlerini, güven aralıklarını ve verilerin basit istatistikleri elde edilerek yorumlanacaktır.</w:t>
+      </w:r>
+    </w:p>
+    <w:p>
+      <w:pPr>
+        <w:pStyle w:val="Heading2"/>
+        <w:numPr>
+          <w:ilvl w:val="1"/>
+          <w:numId w:val="2"/>
+        </w:numPr>
+        <w:ind w:hanging="0" w:start="0"/>
+        <w:rPr>
+          <w:rFonts w:ascii="Liberation Serif" w:hAnsi="Liberation Serif"/>
+        </w:rPr>
+      </w:pPr>
+      <w:r>
+        <w:rPr>
+          <w:rFonts w:ascii="Liberation Serif" w:hAnsi="Liberation Serif"/>
+        </w:rPr>
+        <w:t>Kitle Ortalaması Analizi</w:t>
+      </w:r>
+    </w:p>
+    <w:p>
+      <w:pPr>
+        <w:pStyle w:val="BodyText"/>
+        <w:rPr>
+          <w:rFonts w:ascii="Liberation Serif" w:hAnsi="Liberation Serif"/>
+        </w:rPr>
+      </w:pPr>
+      <w:r>
+        <w:rPr>
+          <w:rFonts w:ascii="Liberation Serif" w:hAnsi="Liberation Serif"/>
+        </w:rPr>
+        <w:tab/>
+      </w:r>
+      <w:r>
+        <w:rPr>
+          <w:rFonts w:ascii="Liberation Serif" w:hAnsi="Liberation Serif"/>
+        </w:rPr>
+        <w:t>Bu başlık altında</w:t>
+      </w:r>
+      <w:r>
+        <w:rPr>
+          <w:rFonts w:ascii="Liberation Serif" w:hAnsi="Liberation Serif"/>
+        </w:rPr>
+        <w:t xml:space="preserve"> </w:t>
+      </w:r>
+      <w:r>
+        <w:rPr>
+          <w:rFonts w:ascii="Liberation Serif" w:hAnsi="Liberation Serif"/>
+        </w:rPr>
+        <w:t>kitle ortalaması (</w:t>
+      </w:r>
+      <w:r>
+        <w:rPr>
+          <w:rFonts w:eastAsia="Times New Roman" w:cs="" w:ascii="Liberation Serif" w:hAnsi="Liberation Serif"/>
+        </w:rPr>
+        <w:t>µ)’na dair hipotez testi, güven aralığı ve verilerin basit istatistikleri analiz edilecektir.  Bu analiz için daha önceden tanıtımı yapılan “mtcars” verisi kullanılacaktır.</w:t>
       </w:r>
     </w:p>
     <w:p>
@@ -1138,12 +1018,6 @@
           <w:szCs w:val="28"/>
         </w:rPr>
         <w:t xml:space="preserve">Verinin Basit İstatistikleri: </w:t>
-      </w:r>
-      <w:r>
-        <w:rPr>
-          <w:rFonts w:ascii="Liberation Serif" w:hAnsi="Liberation Serif"/>
-        </w:rPr>
-        <w:t xml:space="preserve"> </w:t>
       </w:r>
     </w:p>
     <w:p>
@@ -1202,11 +1076,109 @@
           <m:t xml:space="preserve">17,14737</m:t>
         </m:r>
       </m:oMath>
-    </w:p>
-    <w:p>
-      <w:pPr>
-        <w:pStyle w:val="Normal"/>
-        <w:spacing w:lineRule="auto" w:line="240"/>
+      <w:r>
+        <w:rPr>
+          <w:rFonts w:ascii="Liberation Serif" w:hAnsi="Liberation Serif"/>
+        </w:rPr>
+        <w:tab/>
+        <w:tab/>
+        <w:t xml:space="preserve"> </w:t>
+      </w:r>
+      <w:r>
+        <w:rPr>
+          <w:rFonts w:ascii="Liberation Serif" w:hAnsi="Liberation Serif"/>
+        </w:rPr>
+      </w:r>
+      <m:oMath xmlns:m="http://schemas.openxmlformats.org/officeDocument/2006/math">
+        <m:sSub>
+          <m:e>
+            <m:r>
+              <m:t xml:space="preserve">n</m:t>
+            </m:r>
+          </m:e>
+          <m:sub>
+            <m:r>
+              <m:t xml:space="preserve">o</m:t>
+            </m:r>
+          </m:sub>
+        </m:sSub>
+        <m:r>
+          <m:rPr>
+            <m:lit/>
+            <m:nor/>
+          </m:rPr>
+          <m:t xml:space="preserve">=</m:t>
+        </m:r>
+        <m:r>
+          <m:t xml:space="preserve">19</m:t>
+        </m:r>
+      </m:oMath>
+      <w:r>
+        <w:rPr>
+          <w:rFonts w:ascii="Liberation Serif" w:hAnsi="Liberation Serif"/>
+        </w:rPr>
+        <w:t xml:space="preserve"> </w:t>
+        <w:tab/>
+        <w:t xml:space="preserve">  </w:t>
+      </w:r>
+      <w:r>
+        <w:rPr>
+          <w:rFonts w:ascii="Liberation Serif" w:hAnsi="Liberation Serif"/>
+        </w:rPr>
+      </w:r>
+      <m:oMath xmlns:m="http://schemas.openxmlformats.org/officeDocument/2006/math">
+        <m:sSup>
+          <m:e>
+            <m:sSub>
+              <m:e>
+                <m:r>
+                  <m:t xml:space="preserve">S</m:t>
+                </m:r>
+              </m:e>
+              <m:sub>
+                <m:r>
+                  <m:t xml:space="preserve">o</m:t>
+                </m:r>
+              </m:sub>
+            </m:sSub>
+          </m:e>
+          <m:sup>
+            <m:r>
+              <m:t xml:space="preserve">2</m:t>
+            </m:r>
+          </m:sup>
+        </m:sSup>
+        <m:r>
+          <m:rPr>
+            <m:lit/>
+            <m:nor/>
+          </m:rPr>
+          <m:t xml:space="preserve">=</m:t>
+        </m:r>
+        <m:r>
+          <m:t xml:space="preserve">14,69937</m:t>
+        </m:r>
+      </m:oMath>
+    </w:p>
+    <w:p>
+      <w:pPr>
+        <w:pStyle w:val="Normal"/>
+        <w:spacing w:lineRule="auto" w:line="240" w:before="0" w:after="160"/>
+        <w:rPr>
+          <w:rFonts w:ascii="Liberation Serif" w:hAnsi="Liberation Serif"/>
+        </w:rPr>
+      </w:pPr>
+      <w:r>
+        <w:rPr>
+          <w:rFonts w:eastAsia="Times New Roman" w:cs="Times New Roman" w:ascii="Liberation Serif" w:hAnsi="Liberation Serif" w:cstheme="minorAscii" w:eastAsiaTheme="minorAscii"/>
+        </w:rPr>
+        <w:t>Manuel vitesli araçların istatistikleri :</w:t>
+      </w:r>
+    </w:p>
+    <w:p>
+      <w:pPr>
+        <w:pStyle w:val="Normal"/>
+        <w:spacing w:lineRule="auto" w:line="240" w:before="0" w:after="160"/>
         <w:jc w:val="start"/>
         <w:rPr>
           <w:rFonts w:ascii="Liberation Serif" w:hAnsi="Liberation Serif"/>
@@ -1215,6 +1187,139 @@
       <w:r>
         <w:rPr>
           <w:rFonts w:ascii="Liberation Serif" w:hAnsi="Liberation Serif"/>
+        </w:rPr>
+      </w:r>
+      <m:oMath xmlns:m="http://schemas.openxmlformats.org/officeDocument/2006/math">
+        <m:bar>
+          <m:barPr>
+            <m:pos m:val="top"/>
+          </m:barPr>
+          <m:e>
+            <m:sSub>
+              <m:e>
+                <m:r>
+                  <m:t xml:space="preserve">x</m:t>
+                </m:r>
+              </m:e>
+              <m:sub>
+                <m:r>
+                  <m:t xml:space="preserve">m</m:t>
+                </m:r>
+              </m:sub>
+            </m:sSub>
+          </m:e>
+        </m:bar>
+        <m:r>
+          <m:rPr>
+            <m:lit/>
+            <m:nor/>
+          </m:rPr>
+          <m:t xml:space="preserve">=</m:t>
+        </m:r>
+        <m:r>
+          <m:t xml:space="preserve">24.39231</m:t>
+        </m:r>
+      </m:oMath>
+      <w:r>
+        <w:rPr>
+          <w:rFonts w:ascii="Liberation Serif" w:hAnsi="Liberation Serif"/>
+        </w:rPr>
+        <w:t xml:space="preserve"> </w:t>
+      </w:r>
+      <w:r>
+        <w:rPr>
+          <w:rFonts w:ascii="Liberation Serif" w:hAnsi="Liberation Serif"/>
+        </w:rPr>
+        <w:tab/>
+        <w:tab/>
+      </w:r>
+      <w:r>
+        <w:rPr>
+          <w:rFonts w:ascii="Liberation Serif" w:hAnsi="Liberation Serif"/>
+        </w:rPr>
+      </w:r>
+      <m:oMath xmlns:m="http://schemas.openxmlformats.org/officeDocument/2006/math">
+        <m:sSub>
+          <m:e>
+            <m:r>
+              <m:t xml:space="preserve">n</m:t>
+            </m:r>
+          </m:e>
+          <m:sub>
+            <m:r>
+              <m:t xml:space="preserve">m</m:t>
+            </m:r>
+          </m:sub>
+        </m:sSub>
+        <m:r>
+          <m:rPr>
+            <m:lit/>
+            <m:nor/>
+          </m:rPr>
+          <m:t xml:space="preserve">=</m:t>
+        </m:r>
+        <m:r>
+          <m:t xml:space="preserve">13</m:t>
+        </m:r>
+      </m:oMath>
+      <w:r>
+        <w:rPr>
+          <w:rFonts w:ascii="Liberation Serif" w:hAnsi="Liberation Serif"/>
+        </w:rPr>
+        <w:t xml:space="preserve"> </w:t>
+        <w:tab/>
+        <w:t xml:space="preserve"> </w:t>
+      </w:r>
+      <w:r>
+        <w:rPr>
+          <w:rFonts w:ascii="Liberation Serif" w:hAnsi="Liberation Serif"/>
+        </w:rPr>
+      </w:r>
+      <m:oMath xmlns:m="http://schemas.openxmlformats.org/officeDocument/2006/math">
+        <m:sSup>
+          <m:e>
+            <m:sSub>
+              <m:e>
+                <m:r>
+                  <m:t xml:space="preserve">S</m:t>
+                </m:r>
+              </m:e>
+              <m:sub>
+                <m:r>
+                  <m:t xml:space="preserve">m</m:t>
+                </m:r>
+              </m:sub>
+            </m:sSub>
+          </m:e>
+          <m:sup>
+            <m:r>
+              <m:t xml:space="preserve">2</m:t>
+            </m:r>
+          </m:sup>
+        </m:sSup>
+        <m:r>
+          <m:rPr>
+            <m:lit/>
+            <m:nor/>
+          </m:rPr>
+          <m:t xml:space="preserve">=</m:t>
+        </m:r>
+        <m:r>
+          <m:t xml:space="preserve">38.02577</m:t>
+        </m:r>
+      </m:oMath>
+    </w:p>
+    <w:p>
+      <w:pPr>
+        <w:pStyle w:val="Normal"/>
+        <w:spacing w:lineRule="auto" w:line="240" w:before="0" w:after="160"/>
+        <w:rPr>
+          <w:rFonts w:ascii="DejaVu Sans" w:hAnsi="DejaVu Sans"/>
+        </w:rPr>
+      </w:pPr>
+      <w:r>
+        <w:rPr>
+          <w:rFonts w:eastAsia="Times New Roman" w:cs="Times New Roman" w:cstheme="minorAscii" w:eastAsiaTheme="minorAscii" w:ascii="Google Sans Text;sans-serif" w:hAnsi="Google Sans Text;sans-serif"/>
         </w:rPr>
       </w:r>
       <m:oMathPara xmlns:m="http://schemas.openxmlformats.org/officeDocument/2006/math">
@@ -1225,7 +1330,22 @@
           <m:sSub>
             <m:e>
               <m:r>
-                <m:t xml:space="preserve">n</m:t>
+                <m:t xml:space="preserve">H</m:t>
+              </m:r>
+            </m:e>
+            <m:sub>
+              <m:r>
+                <m:t xml:space="preserve">0</m:t>
+              </m:r>
+            </m:sub>
+          </m:sSub>
+          <m:r>
+            <m:t xml:space="preserve">:</m:t>
+          </m:r>
+          <m:sSubSup>
+            <m:e>
+              <m:r>
+                <m:t xml:space="preserve">σ</m:t>
               </m:r>
             </m:e>
             <m:sub>
@@ -1233,131 +1353,32 @@
                 <m:t xml:space="preserve">o</m:t>
               </m:r>
             </m:sub>
-          </m:sSub>
-          <m:r>
-            <m:rPr>
-              <m:lit/>
-              <m:nor/>
-            </m:rPr>
-            <m:t xml:space="preserve">=</m:t>
-          </m:r>
-          <m:r>
-            <m:t xml:space="preserve">19</m:t>
-          </m:r>
-        </m:oMath>
-      </m:oMathPara>
-    </w:p>
-    <w:p>
-      <w:pPr>
-        <w:pStyle w:val="Normal"/>
-        <w:spacing w:lineRule="auto" w:line="240"/>
-        <w:jc w:val="start"/>
-        <w:rPr>
-          <w:rFonts w:ascii="Liberation Serif" w:hAnsi="Liberation Serif"/>
-        </w:rPr>
-      </w:pPr>
-      <w:r>
-        <w:rPr>
-          <w:rFonts w:ascii="Liberation Serif" w:hAnsi="Liberation Serif"/>
-        </w:rPr>
-      </w:r>
-      <m:oMathPara xmlns:m="http://schemas.openxmlformats.org/officeDocument/2006/math">
-        <m:oMathParaPr>
-          <m:jc m:val="left"/>
-        </m:oMathParaPr>
-        <m:oMath>
-          <m:sSup>
-            <m:e>
-              <m:sSub>
-                <m:e>
-                  <m:r>
-                    <m:t xml:space="preserve">S</m:t>
-                  </m:r>
-                </m:e>
-                <m:sub>
-                  <m:r>
-                    <m:t xml:space="preserve">o</m:t>
-                  </m:r>
-                </m:sub>
-              </m:sSub>
-            </m:e>
             <m:sup>
               <m:r>
                 <m:t xml:space="preserve">2</m:t>
               </m:r>
             </m:sup>
-          </m:sSup>
-          <m:r>
-            <m:rPr>
-              <m:lit/>
-              <m:nor/>
-            </m:rPr>
-            <m:t xml:space="preserve">=</m:t>
-          </m:r>
-          <m:r>
-            <m:t xml:space="preserve">14,69937</m:t>
-          </m:r>
-        </m:oMath>
-      </m:oMathPara>
-    </w:p>
-    <w:p>
-      <w:pPr>
-        <w:pStyle w:val="Normal"/>
-        <w:spacing w:lineRule="auto" w:line="240" w:before="0" w:after="160"/>
-        <w:rPr>
-          <w:rFonts w:ascii="Liberation Serif" w:hAnsi="Liberation Serif" w:eastAsia="Times New Roman" w:cs="Times New Roman" w:cstheme="minorAscii" w:eastAsiaTheme="minorAscii"/>
-        </w:rPr>
-      </w:pPr>
-      <w:r>
-        <w:rPr>
-          <w:rFonts w:eastAsia="Times New Roman" w:cs="Times New Roman" w:cstheme="minorAscii" w:eastAsiaTheme="minorAscii" w:ascii="Liberation Serif" w:hAnsi="Liberation Serif"/>
-        </w:rPr>
-        <w:t>Manuel vitesli araçların istatistikleri :</w:t>
-      </w:r>
-    </w:p>
-    <w:p>
-      <w:pPr>
-        <w:pStyle w:val="Normal"/>
-        <w:spacing w:lineRule="auto" w:line="240" w:before="0" w:after="160"/>
-        <w:rPr>
-          <w:rFonts w:ascii="Liberation Serif" w:hAnsi="Liberation Serif" w:eastAsia="Times New Roman" w:cs="Times New Roman" w:cstheme="minorAscii" w:eastAsiaTheme="minorAscii"/>
-        </w:rPr>
-      </w:pPr>
-      <w:r>
-        <w:rPr>
-          <w:rFonts w:eastAsia="Times New Roman" w:cs="Times New Roman" w:cstheme="minorAscii" w:eastAsiaTheme="minorAscii" w:ascii="Liberation Serif" w:hAnsi="Liberation Serif"/>
-        </w:rPr>
-      </w:r>
-      <m:oMathPara xmlns:m="http://schemas.openxmlformats.org/officeDocument/2006/math">
-        <m:oMathParaPr>
-          <m:jc m:val="left"/>
-        </m:oMathParaPr>
-        <m:oMath>
-          <m:bar>
-            <m:barPr>
-              <m:pos m:val="top"/>
-            </m:barPr>
-            <m:e>
-              <m:sSub>
-                <m:e>
-                  <m:r>
-                    <m:t xml:space="preserve">x</m:t>
-                  </m:r>
-                </m:e>
-                <m:sub>
-                  <m:r>
-                    <m:t xml:space="preserve">m</m:t>
-                  </m:r>
-                </m:sub>
-              </m:sSub>
-            </m:e>
-          </m:bar>
+          </m:sSubSup>
           <m:r>
             <m:t xml:space="preserve">=</m:t>
           </m:r>
-          <m:r>
-            <m:t xml:space="preserve">24.39231</m:t>
-          </m:r>
+          <m:sSubSup>
+            <m:e>
+              <m:r>
+                <m:t xml:space="preserve">σ</m:t>
+              </m:r>
+            </m:e>
+            <m:sub>
+              <m:r>
+                <m:t xml:space="preserve">m</m:t>
+              </m:r>
+            </m:sub>
+            <m:sup>
+              <m:r>
+                <m:t xml:space="preserve">2</m:t>
+              </m:r>
+            </m:sup>
+          </m:sSubSup>
         </m:oMath>
       </m:oMathPara>
     </w:p>
@@ -1382,7 +1403,42 @@
           <m:sSub>
             <m:e>
               <m:r>
-                <m:t xml:space="preserve">n</m:t>
+                <m:t xml:space="preserve">H</m:t>
+              </m:r>
+            </m:e>
+            <m:sub>
+              <m:r>
+                <m:t xml:space="preserve">s</m:t>
+              </m:r>
+            </m:sub>
+          </m:sSub>
+          <m:r>
+            <m:t xml:space="preserve">:</m:t>
+          </m:r>
+          <m:sSubSup>
+            <m:e>
+              <m:r>
+                <m:t xml:space="preserve">σ</m:t>
+              </m:r>
+            </m:e>
+            <m:sub>
+              <m:r>
+                <m:t xml:space="preserve">o</m:t>
+              </m:r>
+            </m:sub>
+            <m:sup>
+              <m:r>
+                <m:t xml:space="preserve">2</m:t>
+              </m:r>
+            </m:sup>
+          </m:sSubSup>
+          <m:r>
+            <m:t xml:space="preserve">≠</m:t>
+          </m:r>
+          <m:sSubSup>
+            <m:e>
+              <m:r>
+                <m:t xml:space="preserve">σ</m:t>
               </m:r>
             </m:e>
             <m:sub>
@@ -1390,61 +1446,12 @@
                 <m:t xml:space="preserve">m</m:t>
               </m:r>
             </m:sub>
-          </m:sSub>
-          <m:r>
-            <m:t xml:space="preserve">=</m:t>
-          </m:r>
-          <m:r>
-            <m:t xml:space="preserve">13</m:t>
-          </m:r>
-        </m:oMath>
-      </m:oMathPara>
-    </w:p>
-    <w:p>
-      <w:pPr>
-        <w:pStyle w:val="Normal"/>
-        <w:spacing w:lineRule="auto" w:line="240" w:before="0" w:after="160"/>
-        <w:rPr>
-          <w:rFonts w:ascii="Liberation Serif" w:hAnsi="Liberation Serif" w:eastAsia="Times New Roman" w:cs="Times New Roman" w:cstheme="minorAscii" w:eastAsiaTheme="minorAscii"/>
-        </w:rPr>
-      </w:pPr>
-      <w:r>
-        <w:rPr>
-          <w:rFonts w:eastAsia="Times New Roman" w:cs="Times New Roman" w:cstheme="minorAscii" w:eastAsiaTheme="minorAscii" w:ascii="Liberation Serif" w:hAnsi="Liberation Serif"/>
-        </w:rPr>
-      </w:r>
-      <m:oMathPara xmlns:m="http://schemas.openxmlformats.org/officeDocument/2006/math">
-        <m:oMathParaPr>
-          <m:jc m:val="left"/>
-        </m:oMathParaPr>
-        <m:oMath>
-          <m:sSup>
-            <m:e>
-              <m:sSub>
-                <m:e>
-                  <m:r>
-                    <m:t xml:space="preserve">S</m:t>
-                  </m:r>
-                </m:e>
-                <m:sub>
-                  <m:r>
-                    <m:t xml:space="preserve">m</m:t>
-                  </m:r>
-                </m:sub>
-              </m:sSub>
-            </m:e>
             <m:sup>
               <m:r>
                 <m:t xml:space="preserve">2</m:t>
               </m:r>
             </m:sup>
-          </m:sSup>
-          <m:r>
-            <m:t xml:space="preserve">=</m:t>
-          </m:r>
-          <m:r>
-            <m:t xml:space="preserve">38.02577</m:t>
-          </m:r>
+          </m:sSubSup>
         </m:oMath>
       </m:oMathPara>
     </w:p>
@@ -1494,7 +1501,6 @@
     <w:lvl w:ilvl="1">
       <w:start w:val="1"/>
       <w:numFmt w:val="none"/>
-      <w:pStyle w:val="Heading2"/>
       <w:suff w:val="nothing"/>
       <w:lvlText w:val=""/>
       <w:lvlJc w:val="start"/>
@@ -1508,7 +1514,6 @@
     <w:lvl w:ilvl="2">
       <w:start w:val="1"/>
       <w:numFmt w:val="none"/>
-      <w:pStyle w:val="Heading3"/>
       <w:suff w:val="nothing"/>
       <w:lvlText w:val=""/>
       <w:lvlJc w:val="start"/>
@@ -1598,8 +1603,139 @@
       </w:pPr>
     </w:lvl>
   </w:abstractNum>
+  <w:abstractNum w:abstractNumId="2">
+    <w:lvl w:ilvl="0">
+      <w:start w:val="1"/>
+      <w:numFmt w:val="none"/>
+      <w:suff w:val="nothing"/>
+      <w:lvlText w:val=""/>
+      <w:lvlJc w:val="start"/>
+      <w:pPr>
+        <w:tabs>
+          <w:tab w:val="num" w:pos="0"/>
+        </w:tabs>
+        <w:ind w:start="0" w:hanging="0"/>
+      </w:pPr>
+      <w:rPr/>
+    </w:lvl>
+    <w:lvl w:ilvl="1">
+      <w:start w:val="1"/>
+      <w:numFmt w:val="none"/>
+      <w:suff w:val="nothing"/>
+      <w:lvlText w:val=""/>
+      <w:lvlJc w:val="start"/>
+      <w:pPr>
+        <w:tabs>
+          <w:tab w:val="num" w:pos="0"/>
+        </w:tabs>
+        <w:ind w:start="0" w:hanging="0"/>
+      </w:pPr>
+      <w:rPr/>
+    </w:lvl>
+    <w:lvl w:ilvl="2">
+      <w:start w:val="1"/>
+      <w:numFmt w:val="none"/>
+      <w:suff w:val="nothing"/>
+      <w:lvlText w:val=""/>
+      <w:lvlJc w:val="start"/>
+      <w:pPr>
+        <w:tabs>
+          <w:tab w:val="num" w:pos="0"/>
+        </w:tabs>
+        <w:ind w:start="0" w:hanging="0"/>
+      </w:pPr>
+      <w:rPr/>
+    </w:lvl>
+    <w:lvl w:ilvl="3">
+      <w:start w:val="1"/>
+      <w:numFmt w:val="none"/>
+      <w:suff w:val="nothing"/>
+      <w:lvlText w:val=""/>
+      <w:lvlJc w:val="start"/>
+      <w:pPr>
+        <w:tabs>
+          <w:tab w:val="num" w:pos="0"/>
+        </w:tabs>
+        <w:ind w:start="0" w:hanging="0"/>
+      </w:pPr>
+      <w:rPr/>
+    </w:lvl>
+    <w:lvl w:ilvl="4">
+      <w:start w:val="1"/>
+      <w:numFmt w:val="none"/>
+      <w:suff w:val="nothing"/>
+      <w:lvlText w:val=""/>
+      <w:lvlJc w:val="start"/>
+      <w:pPr>
+        <w:tabs>
+          <w:tab w:val="num" w:pos="0"/>
+        </w:tabs>
+        <w:ind w:start="0" w:hanging="0"/>
+      </w:pPr>
+      <w:rPr/>
+    </w:lvl>
+    <w:lvl w:ilvl="5">
+      <w:start w:val="1"/>
+      <w:numFmt w:val="none"/>
+      <w:suff w:val="nothing"/>
+      <w:lvlText w:val=""/>
+      <w:lvlJc w:val="start"/>
+      <w:pPr>
+        <w:tabs>
+          <w:tab w:val="num" w:pos="0"/>
+        </w:tabs>
+        <w:ind w:start="0" w:hanging="0"/>
+      </w:pPr>
+      <w:rPr/>
+    </w:lvl>
+    <w:lvl w:ilvl="6">
+      <w:start w:val="1"/>
+      <w:numFmt w:val="none"/>
+      <w:suff w:val="nothing"/>
+      <w:lvlText w:val=""/>
+      <w:lvlJc w:val="start"/>
+      <w:pPr>
+        <w:tabs>
+          <w:tab w:val="num" w:pos="0"/>
+        </w:tabs>
+        <w:ind w:start="0" w:hanging="0"/>
+      </w:pPr>
+      <w:rPr/>
+    </w:lvl>
+    <w:lvl w:ilvl="7">
+      <w:start w:val="1"/>
+      <w:numFmt w:val="none"/>
+      <w:suff w:val="nothing"/>
+      <w:lvlText w:val=""/>
+      <w:lvlJc w:val="start"/>
+      <w:pPr>
+        <w:tabs>
+          <w:tab w:val="num" w:pos="0"/>
+        </w:tabs>
+        <w:ind w:start="0" w:hanging="0"/>
+      </w:pPr>
+      <w:rPr/>
+    </w:lvl>
+    <w:lvl w:ilvl="8">
+      <w:start w:val="1"/>
+      <w:numFmt w:val="none"/>
+      <w:suff w:val="nothing"/>
+      <w:lvlText w:val=""/>
+      <w:lvlJc w:val="start"/>
+      <w:pPr>
+        <w:tabs>
+          <w:tab w:val="num" w:pos="0"/>
+        </w:tabs>
+        <w:ind w:start="0" w:hanging="0"/>
+      </w:pPr>
+      <w:rPr/>
+    </w:lvl>
+  </w:abstractNum>
   <w:num w:numId="1">
     <w:abstractNumId w:val="1"/>
+  </w:num>
+  <w:num w:numId="2">
+    <w:abstractNumId w:val="2"/>
   </w:num>
 </w:numbering>
 </file>
@@ -2035,13 +2171,13 @@
   </w:style>
   <w:style w:type="paragraph" w:styleId="Heading2">
     <w:name w:val="heading 2"/>
-    <w:basedOn w:val="Balk"/>
+    <w:basedOn w:val="Balkuser"/>
     <w:next w:val="BodyText"/>
     <w:qFormat/>
     <w:pPr>
       <w:numPr>
         <w:ilvl w:val="1"/>
-        <w:numId w:val="1"/>
+        <w:numId w:val="2"/>
       </w:numPr>
       <w:spacing w:before="200" w:after="120"/>
       <w:outlineLvl w:val="1"/>
@@ -2055,13 +2191,13 @@
   </w:style>
   <w:style w:type="paragraph" w:styleId="Heading3">
     <w:name w:val="heading 3"/>
-    <w:basedOn w:val="Balk"/>
+    <w:basedOn w:val="Balkuser"/>
     <w:next w:val="BodyText"/>
     <w:qFormat/>
     <w:pPr>
       <w:numPr>
         <w:ilvl w:val="2"/>
-        <w:numId w:val="1"/>
+        <w:numId w:val="2"/>
       </w:numPr>
       <w:spacing w:before="140" w:after="120"/>
       <w:outlineLvl w:val="2"/>
@@ -2202,15 +2338,15 @@
     </w:pPr>
     <w:rPr/>
   </w:style>
-  <w:style w:type="paragraph" w:styleId="ereveerii">
-    <w:name w:val="Çerçeve İçeriği"/>
+  <w:style w:type="paragraph" w:styleId="ereveeriiuser">
+    <w:name w:val="Çerçeve İçeriği (user)"/>
     <w:basedOn w:val="Normal"/>
     <w:qFormat/>
     <w:pPr/>
     <w:rPr/>
   </w:style>
-  <w:style w:type="numbering" w:styleId="ListeYokuser" w:default="1">
-    <w:name w:val="Liste Yok (user)"/>
+  <w:style w:type="numbering" w:styleId="ListeYok" w:default="1">
+    <w:name w:val="Liste Yok"/>
     <w:uiPriority w:val="99"/>
     <w:semiHidden/>
     <w:unhideWhenUsed/>

</xml_diff>

<commit_message>
İST268 İst yönt dönem proje ödevi 1. aşama iki örneklem analizi bitti. 2.aşama olan uyum iyiliği testi, bağımsızlık kontrolü ve gruplar arası fark kaldı.
</commit_message>
<xml_diff>
--- a/İST268-1 İstatiksel Yöntemler I/Proje Ödevi/İST268-ist-yönt-odev.docx
+++ b/İST268-1 İstatiksel Yöntemler I/Proje Ödevi/İST268-ist-yönt-odev.docx
@@ -903,7 +903,32 @@
           <w:szCs w:val="24"/>
           <w:lang w:val="en-US"/>
         </w:rPr>
-        <w:t>sleep” veri seti 2 grup öğrenci denek arasında yapılan 2 ilacın uyku sürelerine etkisi üzerine bilgi içermektedir. 3 değişken barındırmaktadır ve bunlar sırasıyla “d”, “group”, “ID”. “d” ilaç verildikten sonra öğrencilerde meydana gelen uyku sürelerindeki artış miktarıdır yani farkıdır (sonra – önce). “group” 2 gruba ayrılan öğrenci gruplarını temsil eder ve gruplar “1” ve “2” değerleri ile ayrıştırılmıştır. “ID” değişkeni ise verilerin, öğrencilerin sırasıyla numaralandırılarak eşlenmesi sağlanmıştır.</w:t>
+        <w:t>sleep” veri seti 2 farklı ilacın uyku sürelerine etkisi üzerine veri içermektedir. 3 değişken barındırmaktadır ve bunlar sırasıyla “d”, “group”, “ID”. “d” 2 ilaçtan birisinin ilaç verildikten sonra öğrencilerde meydana gelen uyku sürelerindeki artış miktarıdır yani farkıdır (sonra – önce). “group” aynı öğrencilere verilen farklı 2 ilaç etkisi ölçüldüğünden dolayı 2 farklı ilacı temsil eder ve 2 ilaç “1” ve “2” değerleri ile ayrıştırılmıştır. “ID” değişkeni ise verilerin, öğrencilerin sırasıyla numaralandırılarak eşlenmesi sağlanmıştır. Aynı ID ye sahip öğrenciler 2 grupta da aynı kişiyi/deneği temsil etmektedir.</w:t>
+      </w:r>
+    </w:p>
+    <w:p>
+      <w:pPr>
+        <w:pStyle w:val="Normal"/>
+        <w:spacing w:lineRule="auto" w:line="240"/>
+        <w:ind w:hanging="0"/>
+        <w:rPr>
+          <w:rFonts w:ascii="Liberation Serif" w:hAnsi="Liberation Serif"/>
+        </w:rPr>
+      </w:pPr>
+      <w:r>
+        <w:rPr>
+          <w:rFonts w:eastAsia="Times New Roman" w:cs="Times New Roman" w:ascii="Liberation Serif" w:hAnsi="Liberation Serif" w:cstheme="minorAscii" w:eastAsiaTheme="minorAscii"/>
+          <w:b w:val="false"/>
+          <w:bCs w:val="false"/>
+          <w:i w:val="false"/>
+          <w:iCs w:val="false"/>
+          <w:caps w:val="false"/>
+          <w:smallCaps w:val="false"/>
+          <w:sz w:val="24"/>
+          <w:szCs w:val="24"/>
+          <w:lang w:val="en-US"/>
+        </w:rPr>
+        <w:t>Uyarı! Burada ilaç sonrası oluşan artış miktarı doğrudan d olan analiz de kullanacağımız fark değişkeni değildir. 2 ayrı ilacın aynı öğrenciler üzerinde yapmış olduğu uyku süresinde artışı göstermektedir.</w:t>
       </w:r>
     </w:p>
     <w:p>
@@ -960,13 +985,7 @@
         <w:rPr>
           <w:rFonts w:ascii="Liberation Serif" w:hAnsi="Liberation Serif"/>
         </w:rPr>
-        <w:t xml:space="preserve">1.1 </w:t>
-      </w:r>
-      <w:r>
-        <w:rPr>
-          <w:rFonts w:ascii="Liberation Serif" w:hAnsi="Liberation Serif"/>
-        </w:rPr>
-        <w:t>Kitle Ortalaması Analizi</w:t>
+        <w:t>1.1 Kitle Ortalaması Analizi</w:t>
       </w:r>
     </w:p>
     <w:p>
@@ -986,26 +1005,17 @@
         <w:rPr>
           <w:rFonts w:eastAsia="Times New Roman" w:cs="" w:ascii="Liberation Serif" w:hAnsi="Liberation Serif"/>
         </w:rPr>
-        <w:t xml:space="preserve">µ)’na dair hipotez testi, güven aralığı ve verilerin basit istatistikleri analiz edilecektir.  Bu analiz için daha önceden tanıtımı yapılan “mtcars” verisi kullanılacaktır. </w:t>
-      </w:r>
-      <w:r>
-        <w:rPr>
-          <w:rFonts w:eastAsia="Times New Roman" w:cs="" w:ascii="Liberation Serif" w:hAnsi="Liberation Serif"/>
-        </w:rPr>
-        <w:t>Verideki 2 grubu sırasıyla 0(automatic) ve 1(manuel) olan verileri labelları atamak için factor fonksiyonunu kullanılmıştır. “mpg” değişkeni de daha kolay kullanım için “yakit” değişkeni olarak tanımlanmıştır.</w:t>
+        <w:t>µ)’na dair hipotez testi, güven aralığı ve verilerin basit istatistikleri analiz edilecektir.  Bu analiz için daha önceden tanıtımı yapılan “mtcars” verisi kullanılacaktır. Verideki 2 grubu sırasıyla 0(automatic) ve 1(manuel) olan verileri labelları atamak için factor fonksiyonunu kullanılmıştır. “mpg” değişkeni de daha kolay kullanım için “yakit” değişkeni olarak tanımlanmıştır.</w:t>
       </w:r>
     </w:p>
     <w:p>
       <w:pPr>
         <w:pStyle w:val="BodyText"/>
         <w:rPr>
-          <w:rFonts w:ascii="Liberation Serif" w:hAnsi="Liberation Serif" w:eastAsia="Times New Roman" w:cs=""/>
-        </w:rPr>
-      </w:pPr>
-      <w:r>
-        <w:rPr>
-          <w:rFonts w:eastAsia="Times New Roman" w:cs="" w:ascii="Liberation Serif" w:hAnsi="Liberation Serif"/>
-        </w:rPr>
+          <w:rFonts w:ascii="Liberation Serif" w:hAnsi="Liberation Serif"/>
+        </w:rPr>
+      </w:pPr>
+      <w:r>
         <w:drawing>
           <wp:anchor distT="0" distB="0" distL="0" distR="0" simplePos="0" relativeHeight="8" behindDoc="0" locked="0" layoutInCell="0" allowOverlap="1">
             <wp:simplePos x="0" y="0"/>
@@ -1109,21 +1119,17 @@
         <w:pStyle w:val="Normal"/>
         <w:spacing w:lineRule="auto" w:line="240"/>
         <w:rPr>
-          <w:rFonts w:ascii="Liberation Serif" w:hAnsi="Liberation Serif" w:eastAsia="Times New Roman" w:cs="Times New Roman" w:cstheme="minorAscii" w:eastAsiaTheme="minorAscii"/>
+          <w:rFonts w:ascii="Liberation Serif" w:hAnsi="Liberation Serif"/>
+        </w:rPr>
+      </w:pPr>
+      <w:r>
+        <w:rPr>
+          <w:rFonts w:eastAsia="Times New Roman" w:cs="Times New Roman" w:ascii="Liberation Serif" w:hAnsi="Liberation Serif" w:cstheme="minorAscii" w:eastAsiaTheme="minorAscii"/>
           <w:b/>
           <w:bCs/>
           <w:sz w:val="28"/>
           <w:szCs w:val="28"/>
         </w:rPr>
-      </w:pPr>
-      <w:r>
-        <w:rPr>
-          <w:rFonts w:eastAsia="Times New Roman" w:cs="Times New Roman" w:cstheme="minorAscii" w:eastAsiaTheme="minorAscii" w:ascii="Liberation Serif" w:hAnsi="Liberation Serif"/>
-          <w:b/>
-          <w:bCs/>
-          <w:sz w:val="28"/>
-          <w:szCs w:val="28"/>
-        </w:rPr>
         <w:t>Verinin Basit İstatistikleri:</w:t>
       </w:r>
     </w:p>
@@ -1132,18 +1138,18 @@
         <w:pStyle w:val="Normal"/>
         <w:spacing w:lineRule="auto" w:line="240"/>
         <w:rPr>
-          <w:rFonts w:ascii="Liberation Serif" w:hAnsi="Liberation Serif" w:eastAsia="Times New Roman" w:cs="Times New Roman" w:cstheme="minorAscii" w:eastAsiaTheme="minorAscii"/>
-        </w:rPr>
-      </w:pPr>
-      <w:r>
-        <w:rPr>
-          <w:rFonts w:eastAsia="Times New Roman" w:cs="Times New Roman" w:cstheme="minorAscii" w:eastAsiaTheme="minorAscii" w:ascii="Liberation Serif" w:hAnsi="Liberation Serif"/>
+          <w:rFonts w:ascii="Liberation Serif" w:hAnsi="Liberation Serif"/>
+        </w:rPr>
+      </w:pPr>
+      <w:r>
+        <w:rPr>
+          <w:rFonts w:eastAsia="Times New Roman" w:cs="Times New Roman" w:ascii="Liberation Serif" w:hAnsi="Liberation Serif" w:cstheme="minorAscii" w:eastAsiaTheme="minorAscii"/>
         </w:rPr>
         <w:t>“</w:t>
       </w:r>
       <w:r>
         <w:rPr>
-          <w:rFonts w:eastAsia="Times New Roman" w:cs="Times New Roman" w:cstheme="minorAscii" w:eastAsiaTheme="minorAscii" w:ascii="Liberation Serif" w:hAnsi="Liberation Serif"/>
+          <w:rFonts w:eastAsia="Times New Roman" w:cs="Times New Roman" w:ascii="Liberation Serif" w:hAnsi="Liberation Serif" w:cstheme="minorAscii" w:eastAsiaTheme="minorAscii"/>
         </w:rPr>
         <w:t>automatic” ve “manuel” araçların yakıt tüketimlerinin örneklem ortalamaları, örneklem büyüklükleri ve örneklem varyansları aşağıdaki kod ile hesaplanmış ve verilmiştir.</w:t>
       </w:r>
@@ -1624,19 +1630,7 @@
         <w:rPr>
           <w:rFonts w:ascii="Liberation Serif" w:hAnsi="Liberation Serif"/>
         </w:rPr>
-        <w:t xml:space="preserve">tapply” fonksiyonu ile birden fazla değişkene </w:t>
-      </w:r>
-      <w:r>
-        <w:rPr>
-          <w:rFonts w:ascii="Liberation Serif" w:hAnsi="Liberation Serif"/>
-        </w:rPr>
-        <w:t>gerekli</w:t>
-      </w:r>
-      <w:r>
-        <w:rPr>
-          <w:rFonts w:ascii="Liberation Serif" w:hAnsi="Liberation Serif"/>
-        </w:rPr>
-        <w:t xml:space="preserve"> fonksiyonlar uygulanmıştır.</w:t>
+        <w:t>tapply” fonksiyonu ile birden fazla değişkene gerekli fonksiyonlar uygulanmıştır.</w:t>
       </w:r>
     </w:p>
     <w:p>
@@ -1658,19 +1652,7 @@
         <w:rPr>
           <w:rFonts w:ascii="Liberation Serif" w:hAnsi="Liberation Serif"/>
         </w:rPr>
-        <w:t>mean</w:t>
-      </w:r>
-      <w:r>
-        <w:rPr>
-          <w:rFonts w:ascii="Liberation Serif" w:hAnsi="Liberation Serif"/>
-        </w:rPr>
-        <w:t xml:space="preserve">” </w:t>
-      </w:r>
-      <w:r>
-        <w:rPr>
-          <w:rFonts w:ascii="Liberation Serif" w:hAnsi="Liberation Serif"/>
-        </w:rPr>
-        <w:t>fonksiyonu ile örneklemin ortalaması, “var” fonksiyonu ile varyans, “length” fonksiyonu ile örneklem büyüklüğü bulunmuştur.</w:t>
+        <w:t>mean” fonksiyonu ile örneklemin ortalaması, “var” fonksiyonu ile varyans, “length” fonksiyonu ile örneklem büyüklüğü bulunmuştur.</w:t>
       </w:r>
     </w:p>
     <w:p>
@@ -1705,19 +1687,7 @@
         <w:rPr>
           <w:rFonts w:ascii="Liberation Serif" w:hAnsi="Liberation Serif"/>
         </w:rPr>
-        <w:t>Otomatik vitesli araçlar ile manuel vitesli araçların yakıt tüketimlerinin ortalamalarının eşit olup olmadığı %</w:t>
-      </w:r>
-      <w:r>
-        <w:rPr>
-          <w:rFonts w:ascii="Liberation Serif" w:hAnsi="Liberation Serif"/>
-        </w:rPr>
-        <w:t xml:space="preserve">95 güven düzeyinde </w:t>
-      </w:r>
-      <w:r>
-        <w:rPr>
-          <w:rFonts w:ascii="Liberation Serif" w:hAnsi="Liberation Serif"/>
-        </w:rPr>
-        <w:t>test edilecektir. O halde hipotezimiz :</w:t>
+        <w:t>Otomatik vitesli araçlar ile manuel vitesli araçların yakıt tüketimlerinin ortalamalarının eşit olup olmadığı %95 güven düzeyinde test edilecektir. O halde hipotezimiz :</w:t>
       </w:r>
     </w:p>
     <w:p>
@@ -1782,6 +1752,10 @@
             </m:sub>
           </m:sSub>
           <m:r>
+            <m:rPr>
+              <m:lit/>
+              <m:nor/>
+            </m:rPr>
             <w:rPr>
               <w:rFonts w:ascii="Cambria Math" w:hAnsi="Cambria Math"/>
             </w:rPr>
@@ -1814,12 +1788,12 @@
         <w:spacing w:lineRule="auto" w:line="240" w:before="0" w:after="160"/>
         <w:jc w:val="left"/>
         <w:rPr>
-          <w:rFonts w:ascii="Liberation Serif" w:hAnsi="Liberation Serif" w:eastAsia="Times New Roman" w:cs=""/>
-        </w:rPr>
-      </w:pPr>
-      <w:r>
-        <w:rPr>
-          <w:rFonts w:eastAsia="Times New Roman" w:cs="" w:ascii="Liberation Serif" w:hAnsi="Liberation Serif"/>
+          <w:rFonts w:ascii="Liberation Serif" w:hAnsi="Liberation Serif"/>
+        </w:rPr>
+      </w:pPr>
+      <w:r>
+        <w:rPr>
+          <w:rFonts w:ascii="Liberation Serif" w:hAnsi="Liberation Serif"/>
         </w:rPr>
       </w:r>
       <m:oMathPara xmlns:m="http://schemas.openxmlformats.org/officeDocument/2006/math">
@@ -1902,7 +1876,7 @@
         <w:spacing w:lineRule="auto" w:line="240" w:before="0" w:after="160"/>
         <w:jc w:val="left"/>
         <w:rPr>
-          <w:rFonts w:ascii="Liberation Serif" w:hAnsi="Liberation Serif" w:eastAsia="Times New Roman" w:cs=""/>
+          <w:rFonts w:ascii="Liberation Serif" w:hAnsi="Liberation Serif"/>
         </w:rPr>
       </w:pPr>
       <w:r>
@@ -1948,6 +1922,7 @@
     <w:p>
       <w:pPr>
         <w:pStyle w:val="BodyText"/>
+        <w:jc w:val="left"/>
         <w:rPr>
           <w:rFonts w:ascii="Liberation Serif" w:hAnsi="Liberation Serif"/>
         </w:rPr>
@@ -1957,7 +1932,7 @@
           <w:rFonts w:ascii="Liberation Serif" w:hAnsi="Liberation Serif"/>
         </w:rPr>
         <w:drawing>
-          <wp:anchor distT="0" distB="0" distL="0" distR="0" simplePos="0" relativeHeight="14" behindDoc="0" locked="0" layoutInCell="0" allowOverlap="1">
+          <wp:anchor distT="0" distB="0" distL="0" distR="0" simplePos="0" relativeHeight="10" behindDoc="0" locked="0" layoutInCell="0" allowOverlap="1">
             <wp:simplePos x="0" y="0"/>
             <wp:positionH relativeFrom="column">
               <wp:posOffset>1388745</wp:posOffset>
@@ -2003,7 +1978,7 @@
           </wp:anchor>
         </w:drawing>
         <w:drawing>
-          <wp:anchor distT="0" distB="0" distL="0" distR="0" simplePos="0" relativeHeight="15" behindDoc="0" locked="0" layoutInCell="0" allowOverlap="1">
+          <wp:anchor distT="0" distB="0" distL="0" distR="0" simplePos="0" relativeHeight="11" behindDoc="0" locked="0" layoutInCell="0" allowOverlap="1">
             <wp:simplePos x="0" y="0"/>
             <wp:positionH relativeFrom="column">
               <wp:posOffset>1366520</wp:posOffset>
@@ -2105,6 +2080,10 @@
             </m:sup>
           </m:sSubSup>
           <m:r>
+            <m:rPr>
+              <m:lit/>
+              <m:nor/>
+            </m:rPr>
             <w:rPr>
               <w:rFonts w:ascii="Cambria Math" w:hAnsi="Cambria Math"/>
             </w:rPr>
@@ -2142,6 +2121,7 @@
     <w:p>
       <w:pPr>
         <w:pStyle w:val="BodyText"/>
+        <w:jc w:val="left"/>
         <w:rPr>
           <w:rFonts w:ascii="Liberation Serif" w:hAnsi="Liberation Serif"/>
         </w:rPr>
@@ -2317,6 +2297,32 @@
         <w:rPr>
           <w:rFonts w:ascii="Liberation Serif" w:hAnsi="Liberation Serif"/>
         </w:rPr>
+      </w:r>
+    </w:p>
+    <w:p>
+      <w:pPr>
+        <w:pStyle w:val="BodyText"/>
+        <w:rPr>
+          <w:rFonts w:ascii="Liberation Serif" w:hAnsi="Liberation Serif"/>
+        </w:rPr>
+      </w:pPr>
+      <w:r>
+        <w:rPr>
+          <w:rFonts w:ascii="Liberation Serif" w:hAnsi="Liberation Serif"/>
+        </w:rPr>
+      </w:r>
+    </w:p>
+    <w:p>
+      <w:pPr>
+        <w:pStyle w:val="BodyText"/>
+        <w:rPr>
+          <w:rFonts w:ascii="Liberation Serif" w:hAnsi="Liberation Serif"/>
+        </w:rPr>
+      </w:pPr>
+      <w:r>
+        <w:rPr>
+          <w:rFonts w:ascii="Liberation Serif" w:hAnsi="Liberation Serif"/>
+        </w:rPr>
         <w:t>“</w:t>
       </w:r>
       <w:r>
@@ -2337,13 +2343,7 @@
         <w:rPr>
           <w:rFonts w:ascii="Liberation Serif" w:hAnsi="Liberation Serif"/>
         </w:rPr>
-        <w:t xml:space="preserve">p değeri 0.06691’dir. </w:t>
-      </w:r>
-      <w:r>
-        <w:rPr>
-          <w:rFonts w:ascii="Liberation Serif" w:hAnsi="Liberation Serif"/>
-        </w:rPr>
-        <w:t xml:space="preserve">p değeri alfa değeri olan 0.05 den büyük olduğu için </w:t>
+        <w:t xml:space="preserve">p değeri 0.06691’dir. p değeri alfa değeri olan 0.05 den büyük olduğu için </w:t>
       </w:r>
       <w:r>
         <w:rPr>
@@ -2358,6 +2358,10 @@
           <m:t xml:space="preserve">p</m:t>
         </m:r>
         <m:r>
+          <m:rPr>
+            <m:lit/>
+            <m:nor/>
+          </m:rPr>
           <w:rPr>
             <w:rFonts w:ascii="Cambria Math" w:hAnsi="Cambria Math"/>
           </w:rPr>
@@ -2587,6 +2591,28 @@
         <w:pStyle w:val="BodyText"/>
         <w:rPr>
           <w:rFonts w:ascii="Liberation Serif" w:hAnsi="Liberation Serif"/>
+          <w:b/>
+          <w:bCs/>
+          <w:sz w:val="28"/>
+          <w:szCs w:val="28"/>
+        </w:rPr>
+      </w:pPr>
+      <w:r>
+        <w:rPr>
+          <w:rFonts w:ascii="Liberation Serif" w:hAnsi="Liberation Serif"/>
+          <w:b/>
+          <w:bCs/>
+          <w:sz w:val="28"/>
+          <w:szCs w:val="28"/>
+        </w:rPr>
+        <w:t>Bulgular ve Sonuç</w:t>
+      </w:r>
+    </w:p>
+    <w:p>
+      <w:pPr>
+        <w:pStyle w:val="BodyText"/>
+        <w:rPr>
+          <w:rFonts w:ascii="Liberation Serif" w:hAnsi="Liberation Serif"/>
         </w:rPr>
       </w:pPr>
       <w:r>
@@ -2632,21 +2658,2550 @@
         <w:rPr>
           <w:rFonts w:ascii="Liberation Serif" w:hAnsi="Liberation Serif"/>
         </w:rPr>
-        <w:t xml:space="preserve">li t-testi sonucuna göre p değeri 0.000285’dir. p değeri </w:t>
-      </w:r>
+        <w:t xml:space="preserve">li t-testi sonucuna göre p değeri 0.000285’dir. p değeri alfa değeri olan 0.05 değerinden küçük olduğu için </w:t>
+      </w:r>
+      <w:r>
+        <w:rPr>
+          <w:rFonts w:ascii="Liberation Serif" w:hAnsi="Liberation Serif"/>
+        </w:rPr>
+      </w:r>
+      <m:oMath xmlns:m="http://schemas.openxmlformats.org/officeDocument/2006/math">
+        <m:sSub>
+          <m:e>
+            <m:r>
+              <w:rPr>
+                <w:rFonts w:ascii="Cambria Math" w:hAnsi="Cambria Math"/>
+              </w:rPr>
+              <m:t xml:space="preserve">H</m:t>
+            </m:r>
+          </m:e>
+          <m:sub>
+            <m:r>
+              <w:rPr>
+                <w:rFonts w:ascii="Cambria Math" w:hAnsi="Cambria Math"/>
+              </w:rPr>
+              <m:t xml:space="preserve">0</m:t>
+            </m:r>
+          </m:sub>
+        </m:sSub>
+      </m:oMath>
+      <w:r>
+        <w:rPr>
+          <w:rFonts w:ascii="Liberation Serif" w:hAnsi="Liberation Serif"/>
+        </w:rPr>
+        <w:t xml:space="preserve"> hipotezi RED’dir. Aynı zamanda test sonucunda güven aralığı sonucuna bakarak da bu sonuca ulaşabiliriz. Güven aralığının alt sınırı -10.84837’dir, üst sınırı ise -3.64151’dir. </w:t>
+      </w:r>
+      <w:r>
+        <w:rPr>
+          <w:rFonts w:ascii="Liberation Serif" w:hAnsi="Liberation Serif"/>
+        </w:rPr>
+      </w:r>
+      <m:oMath xmlns:m="http://schemas.openxmlformats.org/officeDocument/2006/math">
+        <m:sSub>
+          <m:e>
+            <m:r>
+              <w:rPr>
+                <w:rFonts w:ascii="Cambria Math" w:hAnsi="Cambria Math"/>
+              </w:rPr>
+              <m:t xml:space="preserve">H</m:t>
+            </m:r>
+          </m:e>
+          <m:sub>
+            <m:r>
+              <w:rPr>
+                <w:rFonts w:ascii="Cambria Math" w:hAnsi="Cambria Math"/>
+              </w:rPr>
+              <m:t xml:space="preserve">0</m:t>
+            </m:r>
+          </m:sub>
+        </m:sSub>
+      </m:oMath>
+      <w:r>
+        <w:rPr>
+          <w:rFonts w:ascii="Liberation Serif" w:hAnsi="Liberation Serif"/>
+        </w:rPr>
+        <w:t xml:space="preserve"> hipotezi aynı zamanda </w:t>
+      </w:r>
+      <w:r>
+        <w:rPr>
+          <w:rFonts w:ascii="Liberation Serif" w:hAnsi="Liberation Serif"/>
+        </w:rPr>
+      </w:r>
+      <m:oMath xmlns:m="http://schemas.openxmlformats.org/officeDocument/2006/math">
+        <m:sSub>
+          <m:e>
+            <m:r>
+              <w:rPr>
+                <w:rFonts w:ascii="Cambria Math" w:hAnsi="Cambria Math"/>
+              </w:rPr>
+              <m:t xml:space="preserve">µ</m:t>
+            </m:r>
+          </m:e>
+          <m:sub>
+            <m:r>
+              <w:rPr>
+                <w:rFonts w:ascii="Cambria Math" w:hAnsi="Cambria Math"/>
+              </w:rPr>
+              <m:t xml:space="preserve">o</m:t>
+            </m:r>
+          </m:sub>
+        </m:sSub>
+        <m:r>
+          <w:rPr>
+            <w:rFonts w:ascii="Cambria Math" w:hAnsi="Cambria Math"/>
+          </w:rPr>
+          <m:t xml:space="preserve">−</m:t>
+        </m:r>
+        <m:sSub>
+          <m:e>
+            <m:r>
+              <w:rPr>
+                <w:rFonts w:ascii="Cambria Math" w:hAnsi="Cambria Math"/>
+              </w:rPr>
+              <m:t xml:space="preserve">µ</m:t>
+            </m:r>
+          </m:e>
+          <m:sub>
+            <m:r>
+              <w:rPr>
+                <w:rFonts w:ascii="Cambria Math" w:hAnsi="Cambria Math"/>
+              </w:rPr>
+              <m:t xml:space="preserve">m</m:t>
+            </m:r>
+          </m:sub>
+        </m:sSub>
+        <m:r>
+          <m:rPr>
+            <m:lit/>
+            <m:nor/>
+          </m:rPr>
+          <w:rPr>
+            <w:rFonts w:ascii="Cambria Math" w:hAnsi="Cambria Math"/>
+          </w:rPr>
+          <m:t xml:space="preserve">=</m:t>
+        </m:r>
+        <m:r>
+          <w:rPr>
+            <w:rFonts w:ascii="Cambria Math" w:hAnsi="Cambria Math"/>
+          </w:rPr>
+          <m:t xml:space="preserve">0</m:t>
+        </m:r>
+      </m:oMath>
+      <w:r>
+        <w:rPr>
+          <w:rFonts w:ascii="Liberation Serif" w:hAnsi="Liberation Serif"/>
+        </w:rPr>
+        <w:t xml:space="preserve"> olduğu bilinmektedir. 0 değeri güven aralığı içerisinde yer almadığından dolayı </w:t>
+      </w:r>
+      <w:r>
+        <w:rPr>
+          <w:rFonts w:ascii="Liberation Serif" w:hAnsi="Liberation Serif"/>
+        </w:rPr>
+      </w:r>
+      <m:oMath xmlns:m="http://schemas.openxmlformats.org/officeDocument/2006/math">
+        <m:sSub>
+          <m:e>
+            <m:r>
+              <w:rPr>
+                <w:rFonts w:ascii="Cambria Math" w:hAnsi="Cambria Math"/>
+              </w:rPr>
+              <m:t xml:space="preserve">H</m:t>
+            </m:r>
+          </m:e>
+          <m:sub>
+            <m:r>
+              <w:rPr>
+                <w:rFonts w:ascii="Cambria Math" w:hAnsi="Cambria Math"/>
+              </w:rPr>
+              <m:t xml:space="preserve">0</m:t>
+            </m:r>
+          </m:sub>
+        </m:sSub>
+      </m:oMath>
+      <w:r>
+        <w:rPr>
+          <w:rFonts w:ascii="Liberation Serif" w:hAnsi="Liberation Serif"/>
+        </w:rPr>
+        <w:t xml:space="preserve"> hipotezi bu şekilde değerlendirildiğinde de reddedilebilir.</w:t>
+      </w:r>
+    </w:p>
+    <w:p>
+      <w:pPr>
+        <w:pStyle w:val="BodyText"/>
+        <w:rPr>
+          <w:rFonts w:ascii="Liberation Serif" w:hAnsi="Liberation Serif"/>
+        </w:rPr>
+      </w:pPr>
+      <w:r>
+        <w:rPr>
+          <w:rFonts w:ascii="Liberation Serif" w:hAnsi="Liberation Serif"/>
+        </w:rPr>
+        <w:t>Elde edilen sonuç; iki grup arasındaki ortalama yakıt tüketimi eşit miktarda olmadığı %95 güven düzeyinde söylenebilir.</w:t>
+      </w:r>
+    </w:p>
+    <w:p>
+      <w:pPr>
+        <w:pStyle w:val="Heading2"/>
+        <w:numPr>
+          <w:ilvl w:val="0"/>
+          <w:numId w:val="0"/>
+        </w:numPr>
+        <w:ind w:hanging="0" w:left="0"/>
+        <w:rPr>
+          <w:rFonts w:ascii="Liberation Serif" w:hAnsi="Liberation Serif"/>
+        </w:rPr>
+      </w:pPr>
+      <w:r>
+        <w:rPr>
+          <w:rFonts w:ascii="Liberation Serif" w:hAnsi="Liberation Serif"/>
+        </w:rPr>
+        <w:t>1.3 Kitle Oranı Analizi</w:t>
+      </w:r>
+    </w:p>
+    <w:p>
+      <w:pPr>
+        <w:pStyle w:val="BodyText"/>
+        <w:rPr>
+          <w:rFonts w:ascii="Liberation Serif" w:hAnsi="Liberation Serif"/>
+        </w:rPr>
+      </w:pPr>
+      <w:r>
+        <w:rPr>
+          <w:rFonts w:ascii="Liberation Serif" w:hAnsi="Liberation Serif"/>
+        </w:rPr>
+        <w:t xml:space="preserve">Kitledeki belirli bir özelliğe dair oran analizi için “Titanic” veri seti kullanılacaktır. Daha önce verinin tanıtımı yapılmıştır. Kısaca bahsetmek gerekirse veri doğrudan </w:t>
+      </w:r>
+      <w:r>
+        <w:rPr>
+          <w:rFonts w:ascii="Liberation Serif" w:hAnsi="Liberation Serif"/>
+          <w:i/>
+          <w:iCs/>
+        </w:rPr>
+        <w:t>raw</w:t>
+      </w:r>
+      <w:r>
+        <w:rPr>
+          <w:rFonts w:ascii="Liberation Serif" w:hAnsi="Liberation Serif"/>
+        </w:rPr>
+        <w:t xml:space="preserve"> formatta değildir. Kategorik şekilde bazı özelliklere göre frekanslar verilmiştir. Titanic gemi kazasında hayatta kalan yetişkin kadınlar ile yetişkin erkeklerin hayatta kalma oranları kıyaslanıcaktır.</w:t>
+      </w:r>
+    </w:p>
+    <w:p>
+      <w:pPr>
+        <w:pStyle w:val="BodyText"/>
+        <w:rPr>
+          <w:rFonts w:ascii="Liberation Serif" w:hAnsi="Liberation Serif"/>
+        </w:rPr>
+      </w:pPr>
+      <w:r>
+        <w:rPr>
+          <w:rFonts w:ascii="Liberation Serif" w:hAnsi="Liberation Serif"/>
+        </w:rPr>
+        <w:t>Veride çocukların da verileri olduğu için R da sadece yetişkin insanların verilerini elde etmek için aşağıdaki kod kullanılmıştır. Ve yetişkinlere dair cinsiyetlerine göre hayatta kalma oranları aşağıdaki gibidir</w:t>
+      </w:r>
+    </w:p>
+    <w:p>
+      <w:pPr>
+        <w:pStyle w:val="BodyText"/>
+        <w:rPr>
+          <w:rFonts w:ascii="Liberation Serif" w:hAnsi="Liberation Serif"/>
+        </w:rPr>
+      </w:pPr>
+      <w:r>
+        <w:rPr>
+          <w:rFonts w:ascii="Liberation Serif" w:hAnsi="Liberation Serif"/>
+        </w:rPr>
+        <w:drawing>
+          <wp:inline distT="0" distB="0" distL="0" distR="0">
+            <wp:extent cx="1856740" cy="2999740"/>
+            <wp:effectExtent l="0" t="0" r="0" b="0"/>
+            <wp:docPr id="7" name="Görüntü7"/>
+            <wp:cNvGraphicFramePr>
+              <a:graphicFrameLocks xmlns:a="http://schemas.openxmlformats.org/drawingml/2006/main" noChangeAspect="1"/>
+            </wp:cNvGraphicFramePr>
+            <a:graphic xmlns:a="http://schemas.openxmlformats.org/drawingml/2006/main">
+              <a:graphicData uri="http://schemas.openxmlformats.org/drawingml/2006/picture">
+                <pic:pic xmlns:pic="http://schemas.openxmlformats.org/drawingml/2006/picture">
+                  <pic:nvPicPr>
+                    <pic:cNvPr id="7" name="Görüntü7"/>
+                    <pic:cNvPicPr>
+                      <a:picLocks noChangeAspect="1" noChangeArrowheads="1"/>
+                    </pic:cNvPicPr>
+                  </pic:nvPicPr>
+                  <pic:blipFill>
+                    <a:blip r:embed="rId10"/>
+                    <a:stretch>
+                      <a:fillRect/>
+                    </a:stretch>
+                  </pic:blipFill>
+                  <pic:spPr bwMode="auto">
+                    <a:xfrm>
+                      <a:off x="0" y="0"/>
+                      <a:ext cx="1856740" cy="2999740"/>
+                    </a:xfrm>
+                    <a:prstGeom prst="rect">
+                      <a:avLst/>
+                    </a:prstGeom>
+                    <a:noFill/>
+                  </pic:spPr>
+                </pic:pic>
+              </a:graphicData>
+            </a:graphic>
+          </wp:inline>
+        </w:drawing>
+      </w:r>
+      <w:r>
+        <w:rPr>
+          <w:rFonts w:ascii="Liberation Serif" w:hAnsi="Liberation Serif"/>
+        </w:rPr>
+        <w:drawing>
+          <wp:inline distT="0" distB="0" distL="0" distR="0">
+            <wp:extent cx="2482215" cy="1009650"/>
+            <wp:effectExtent l="0" t="0" r="0" b="0"/>
+            <wp:docPr id="8" name="Görüntü8"/>
+            <wp:cNvGraphicFramePr>
+              <a:graphicFrameLocks xmlns:a="http://schemas.openxmlformats.org/drawingml/2006/main" noChangeAspect="1"/>
+            </wp:cNvGraphicFramePr>
+            <a:graphic xmlns:a="http://schemas.openxmlformats.org/drawingml/2006/main">
+              <a:graphicData uri="http://schemas.openxmlformats.org/drawingml/2006/picture">
+                <pic:pic xmlns:pic="http://schemas.openxmlformats.org/drawingml/2006/picture">
+                  <pic:nvPicPr>
+                    <pic:cNvPr id="8" name="Görüntü8"/>
+                    <pic:cNvPicPr>
+                      <a:picLocks noChangeAspect="1" noChangeArrowheads="1"/>
+                    </pic:cNvPicPr>
+                  </pic:nvPicPr>
+                  <pic:blipFill>
+                    <a:blip r:embed="rId11"/>
+                    <a:stretch>
+                      <a:fillRect/>
+                    </a:stretch>
+                  </pic:blipFill>
+                  <pic:spPr bwMode="auto">
+                    <a:xfrm>
+                      <a:off x="0" y="0"/>
+                      <a:ext cx="2482215" cy="1009650"/>
+                    </a:xfrm>
+                    <a:prstGeom prst="rect">
+                      <a:avLst/>
+                    </a:prstGeom>
+                    <a:noFill/>
+                  </pic:spPr>
+                </pic:pic>
+              </a:graphicData>
+            </a:graphic>
+          </wp:inline>
+        </w:drawing>
+      </w:r>
+      <w:r>
+        <w:rPr>
+          <w:rFonts w:ascii="Liberation Serif" w:hAnsi="Liberation Serif"/>
+        </w:rPr>
+        <w:t xml:space="preserve"> </w:t>
+      </w:r>
+    </w:p>
+    <w:p>
+      <w:pPr>
+        <w:pStyle w:val="BodyText"/>
+        <w:rPr>
+          <w:rFonts w:ascii="Liberation Serif" w:hAnsi="Liberation Serif"/>
+        </w:rPr>
+      </w:pPr>
+      <w:r>
+        <w:rPr>
+          <w:rFonts w:ascii="Liberation Serif" w:hAnsi="Liberation Serif"/>
+        </w:rPr>
+        <w:t>Hayatta kalan kadınların tüm kadınlara oranı yani kadınların hayatta kalma oranı = 0,7435</w:t>
+      </w:r>
+    </w:p>
+    <w:p>
+      <w:pPr>
+        <w:pStyle w:val="BodyText"/>
+        <w:rPr>
+          <w:rFonts w:ascii="Liberation Serif" w:hAnsi="Liberation Serif"/>
+        </w:rPr>
+      </w:pPr>
+      <w:r>
+        <w:rPr>
+          <w:rFonts w:ascii="Liberation Serif" w:hAnsi="Liberation Serif"/>
+        </w:rPr>
+        <w:t>Hayatta kalan erkeklerin tüm erkeklere oranı yani erkeklerin hayatta kalma oranı = 0,2027</w:t>
+      </w:r>
+    </w:p>
+    <w:p>
+      <w:pPr>
+        <w:pStyle w:val="BodyText"/>
+        <w:rPr>
+          <w:rFonts w:ascii="Liberation Serif" w:hAnsi="Liberation Serif"/>
+        </w:rPr>
+      </w:pPr>
+      <w:r>
+        <w:rPr>
+          <w:rFonts w:ascii="Liberation Serif" w:hAnsi="Liberation Serif"/>
+        </w:rPr>
+        <w:t>Hipotez :</w:t>
+      </w:r>
+    </w:p>
+    <w:p>
+      <w:pPr>
+        <w:pStyle w:val="BodyText"/>
+        <w:jc w:val="left"/>
+        <w:rPr>
+          <w:rFonts w:ascii="Liberation Serif" w:hAnsi="Liberation Serif"/>
+        </w:rPr>
+      </w:pPr>
+      <w:r>
+        <w:rPr>
+          <w:rFonts w:ascii="Liberation Serif" w:hAnsi="Liberation Serif"/>
+        </w:rPr>
+      </w:r>
+      <m:oMathPara xmlns:m="http://schemas.openxmlformats.org/officeDocument/2006/math">
+        <m:oMathParaPr>
+          <m:jc m:val="left"/>
+        </m:oMathParaPr>
+        <m:oMath>
+          <m:sSub>
+            <m:e>
+              <m:r>
+                <w:rPr>
+                  <w:rFonts w:ascii="Cambria Math" w:hAnsi="Cambria Math"/>
+                </w:rPr>
+                <m:t xml:space="preserve">H</m:t>
+              </m:r>
+            </m:e>
+            <m:sub>
+              <m:r>
+                <w:rPr>
+                  <w:rFonts w:ascii="Cambria Math" w:hAnsi="Cambria Math"/>
+                </w:rPr>
+                <m:t xml:space="preserve">0</m:t>
+              </m:r>
+            </m:sub>
+          </m:sSub>
+          <m:r>
+            <w:rPr>
+              <w:rFonts w:ascii="Cambria Math" w:hAnsi="Cambria Math"/>
+            </w:rPr>
+            <m:t xml:space="preserve">:</m:t>
+          </m:r>
+          <m:sSub>
+            <m:e>
+              <m:r>
+                <w:rPr>
+                  <w:rFonts w:ascii="Cambria Math" w:hAnsi="Cambria Math"/>
+                </w:rPr>
+                <m:t xml:space="preserve">p</m:t>
+              </m:r>
+            </m:e>
+            <m:sub>
+              <m:r>
+                <w:rPr>
+                  <w:rFonts w:ascii="Cambria Math" w:hAnsi="Cambria Math"/>
+                </w:rPr>
+                <m:t xml:space="preserve">k</m:t>
+              </m:r>
+            </m:sub>
+          </m:sSub>
+          <m:r>
+            <m:rPr>
+              <m:lit/>
+              <m:nor/>
+            </m:rPr>
+            <w:rPr>
+              <w:rFonts w:ascii="Cambria Math" w:hAnsi="Cambria Math"/>
+            </w:rPr>
+            <m:t xml:space="preserve">=</m:t>
+          </m:r>
+          <m:sSub>
+            <m:e>
+              <m:r>
+                <w:rPr>
+                  <w:rFonts w:ascii="Cambria Math" w:hAnsi="Cambria Math"/>
+                </w:rPr>
+                <m:t xml:space="preserve">p</m:t>
+              </m:r>
+            </m:e>
+            <m:sub>
+              <m:r>
+                <w:rPr>
+                  <w:rFonts w:ascii="Cambria Math" w:hAnsi="Cambria Math"/>
+                </w:rPr>
+                <m:t xml:space="preserve">e</m:t>
+              </m:r>
+            </m:sub>
+          </m:sSub>
+        </m:oMath>
+      </m:oMathPara>
+    </w:p>
+    <w:p>
+      <w:pPr>
+        <w:pStyle w:val="BodyText"/>
+        <w:jc w:val="left"/>
+        <w:rPr>
+          <w:rFonts w:ascii="Liberation Serif" w:hAnsi="Liberation Serif"/>
+        </w:rPr>
+      </w:pPr>
+      <w:r>
+        <w:rPr>
+          <w:rFonts w:ascii="Liberation Serif" w:hAnsi="Liberation Serif"/>
+        </w:rPr>
+      </w:r>
+      <m:oMathPara xmlns:m="http://schemas.openxmlformats.org/officeDocument/2006/math">
+        <m:oMathParaPr>
+          <m:jc m:val="left"/>
+        </m:oMathParaPr>
+        <m:oMath>
+          <m:sSub>
+            <m:e>
+              <m:r>
+                <w:rPr>
+                  <w:rFonts w:ascii="Cambria Math" w:hAnsi="Cambria Math"/>
+                </w:rPr>
+                <m:t xml:space="preserve">H</m:t>
+              </m:r>
+            </m:e>
+            <m:sub>
+              <m:r>
+                <w:rPr>
+                  <w:rFonts w:ascii="Cambria Math" w:hAnsi="Cambria Math"/>
+                </w:rPr>
+                <m:t xml:space="preserve">s</m:t>
+              </m:r>
+            </m:sub>
+          </m:sSub>
+          <m:r>
+            <w:rPr>
+              <w:rFonts w:ascii="Cambria Math" w:hAnsi="Cambria Math"/>
+            </w:rPr>
+            <m:t xml:space="preserve">:</m:t>
+          </m:r>
+          <m:sSub>
+            <m:e>
+              <m:r>
+                <w:rPr>
+                  <w:rFonts w:ascii="Cambria Math" w:hAnsi="Cambria Math"/>
+                </w:rPr>
+                <m:t xml:space="preserve">p</m:t>
+              </m:r>
+            </m:e>
+            <m:sub>
+              <m:r>
+                <w:rPr>
+                  <w:rFonts w:ascii="Cambria Math" w:hAnsi="Cambria Math"/>
+                </w:rPr>
+                <m:t xml:space="preserve">k</m:t>
+              </m:r>
+            </m:sub>
+          </m:sSub>
+          <m:r>
+            <w:rPr>
+              <w:rFonts w:ascii="Cambria Math" w:hAnsi="Cambria Math"/>
+            </w:rPr>
+            <m:t xml:space="preserve">≠</m:t>
+          </m:r>
+          <m:sSub>
+            <m:e>
+              <m:r>
+                <w:rPr>
+                  <w:rFonts w:ascii="Cambria Math" w:hAnsi="Cambria Math"/>
+                </w:rPr>
+                <m:t xml:space="preserve">p</m:t>
+              </m:r>
+            </m:e>
+            <m:sub>
+              <m:r>
+                <w:rPr>
+                  <w:rFonts w:ascii="Cambria Math" w:hAnsi="Cambria Math"/>
+                </w:rPr>
+                <m:t xml:space="preserve">e</m:t>
+              </m:r>
+            </m:sub>
+          </m:sSub>
+        </m:oMath>
+      </m:oMathPara>
+    </w:p>
+    <w:p>
+      <w:pPr>
+        <w:pStyle w:val="BodyText"/>
+        <w:rPr>
+          <w:rFonts w:ascii="Liberation Serif" w:hAnsi="Liberation Serif"/>
+        </w:rPr>
+      </w:pPr>
+      <w:r>
+        <w:rPr>
+          <w:rFonts w:ascii="Liberation Serif" w:hAnsi="Liberation Serif"/>
+        </w:rPr>
+        <w:t>R’da oran testi yapmak için “prop.test” fonksiyonu kullanılmıştır.</w:t>
+      </w:r>
+    </w:p>
+    <w:p>
+      <w:pPr>
+        <w:pStyle w:val="BodyText"/>
+        <w:rPr>
+          <w:rFonts w:ascii="Liberation Serif" w:hAnsi="Liberation Serif"/>
+        </w:rPr>
+      </w:pPr>
+      <w:r>
+        <w:rPr>
+          <w:rFonts w:ascii="Liberation Serif" w:hAnsi="Liberation Serif"/>
+        </w:rPr>
+        <w:drawing>
+          <wp:inline distT="0" distB="0" distL="0" distR="0">
+            <wp:extent cx="3228340" cy="227965"/>
+            <wp:effectExtent l="0" t="0" r="0" b="0"/>
+            <wp:docPr id="9" name="Görüntü9"/>
+            <wp:cNvGraphicFramePr>
+              <a:graphicFrameLocks xmlns:a="http://schemas.openxmlformats.org/drawingml/2006/main" noChangeAspect="1"/>
+            </wp:cNvGraphicFramePr>
+            <a:graphic xmlns:a="http://schemas.openxmlformats.org/drawingml/2006/main">
+              <a:graphicData uri="http://schemas.openxmlformats.org/drawingml/2006/picture">
+                <pic:pic xmlns:pic="http://schemas.openxmlformats.org/drawingml/2006/picture">
+                  <pic:nvPicPr>
+                    <pic:cNvPr id="9" name="Görüntü9"/>
+                    <pic:cNvPicPr>
+                      <a:picLocks noChangeAspect="1" noChangeArrowheads="1"/>
+                    </pic:cNvPicPr>
+                  </pic:nvPicPr>
+                  <pic:blipFill>
+                    <a:blip r:embed="rId12"/>
+                    <a:stretch>
+                      <a:fillRect/>
+                    </a:stretch>
+                  </pic:blipFill>
+                  <pic:spPr bwMode="auto">
+                    <a:xfrm>
+                      <a:off x="0" y="0"/>
+                      <a:ext cx="3228340" cy="227965"/>
+                    </a:xfrm>
+                    <a:prstGeom prst="rect">
+                      <a:avLst/>
+                    </a:prstGeom>
+                    <a:noFill/>
+                  </pic:spPr>
+                </pic:pic>
+              </a:graphicData>
+            </a:graphic>
+          </wp:inline>
+        </w:drawing>
+      </w:r>
+    </w:p>
+    <w:p>
+      <w:pPr>
+        <w:pStyle w:val="BodyText"/>
+        <w:rPr>
+          <w:rFonts w:ascii="Liberation Serif" w:hAnsi="Liberation Serif"/>
+        </w:rPr>
+      </w:pPr>
+      <w:r>
+        <w:rPr>
+          <w:rFonts w:ascii="Liberation Serif" w:hAnsi="Liberation Serif"/>
+        </w:rPr>
+        <w:drawing>
+          <wp:inline distT="0" distB="0" distL="0" distR="0">
+            <wp:extent cx="5731510" cy="1645920"/>
+            <wp:effectExtent l="0" t="0" r="0" b="0"/>
+            <wp:docPr id="10" name="Görüntü10"/>
+            <wp:cNvGraphicFramePr>
+              <a:graphicFrameLocks xmlns:a="http://schemas.openxmlformats.org/drawingml/2006/main" noChangeAspect="1"/>
+            </wp:cNvGraphicFramePr>
+            <a:graphic xmlns:a="http://schemas.openxmlformats.org/drawingml/2006/main">
+              <a:graphicData uri="http://schemas.openxmlformats.org/drawingml/2006/picture">
+                <pic:pic xmlns:pic="http://schemas.openxmlformats.org/drawingml/2006/picture">
+                  <pic:nvPicPr>
+                    <pic:cNvPr id="10" name="Görüntü10"/>
+                    <pic:cNvPicPr>
+                      <a:picLocks noChangeAspect="1" noChangeArrowheads="1"/>
+                    </pic:cNvPicPr>
+                  </pic:nvPicPr>
+                  <pic:blipFill>
+                    <a:blip r:embed="rId13"/>
+                    <a:stretch>
+                      <a:fillRect/>
+                    </a:stretch>
+                  </pic:blipFill>
+                  <pic:spPr bwMode="auto">
+                    <a:xfrm>
+                      <a:off x="0" y="0"/>
+                      <a:ext cx="5731510" cy="1645920"/>
+                    </a:xfrm>
+                    <a:prstGeom prst="rect">
+                      <a:avLst/>
+                    </a:prstGeom>
+                    <a:noFill/>
+                  </pic:spPr>
+                </pic:pic>
+              </a:graphicData>
+            </a:graphic>
+          </wp:inline>
+        </w:drawing>
+      </w:r>
+    </w:p>
+    <w:p>
+      <w:pPr>
+        <w:pStyle w:val="BodyText"/>
+        <w:rPr>
+          <w:rFonts w:ascii="Liberation Serif" w:hAnsi="Liberation Serif"/>
+          <w:b/>
+          <w:bCs/>
+          <w:sz w:val="28"/>
+          <w:szCs w:val="28"/>
+        </w:rPr>
+      </w:pPr>
+      <w:r>
+        <w:rPr>
+          <w:rFonts w:ascii="Liberation Serif" w:hAnsi="Liberation Serif"/>
+          <w:b/>
+          <w:bCs/>
+          <w:sz w:val="28"/>
+          <w:szCs w:val="28"/>
+        </w:rPr>
+        <w:t>Bulgular ve Sonuç</w:t>
+      </w:r>
+    </w:p>
+    <w:p>
+      <w:pPr>
+        <w:pStyle w:val="BodyText"/>
+        <w:rPr>
+          <w:rFonts w:ascii="Liberation Serif" w:hAnsi="Liberation Serif"/>
+        </w:rPr>
+      </w:pPr>
+      <w:r>
+        <w:rPr>
+          <w:rFonts w:ascii="Liberation Serif" w:hAnsi="Liberation Serif"/>
+        </w:rPr>
+        <w:t xml:space="preserve">p değeri çok çok küşük bir değer olan 2.2e-16 dan daha kğçğk bir değer çıktı yani alfa değerimiz olan 0.05 den çok ama çok küçük bir değermiş p değeri. P değeri alfa değerinden küçük olduğundan </w:t>
+      </w:r>
+      <w:r>
+        <w:rPr>
+          <w:rFonts w:ascii="Liberation Serif" w:hAnsi="Liberation Serif"/>
+        </w:rPr>
+      </w:r>
+      <m:oMath xmlns:m="http://schemas.openxmlformats.org/officeDocument/2006/math">
+        <m:r>
+          <w:rPr>
+            <w:rFonts w:ascii="Cambria Math" w:hAnsi="Cambria Math"/>
+          </w:rPr>
+          <m:t xml:space="preserve">p</m:t>
+        </m:r>
+        <m:r>
+          <m:rPr>
+            <m:lit/>
+            <m:nor/>
+          </m:rPr>
+          <w:rPr>
+            <w:rFonts w:ascii="Cambria Math" w:hAnsi="Cambria Math"/>
+          </w:rPr>
+          <m:t xml:space="preserve">&lt;</m:t>
+        </m:r>
+        <m:r>
+          <w:rPr>
+            <w:rFonts w:ascii="Cambria Math" w:hAnsi="Cambria Math"/>
+          </w:rPr>
+          <m:t xml:space="preserve">0.05</m:t>
+        </m:r>
+      </m:oMath>
+      <w:r>
+        <w:rPr>
+          <w:rFonts w:ascii="Liberation Serif" w:hAnsi="Liberation Serif"/>
+        </w:rPr>
+        <w:t xml:space="preserve"> </w:t>
+      </w:r>
+      <w:r>
+        <w:rPr>
+          <w:rFonts w:ascii="Liberation Serif" w:hAnsi="Liberation Serif"/>
+        </w:rPr>
+      </w:r>
+      <m:oMath xmlns:m="http://schemas.openxmlformats.org/officeDocument/2006/math">
+        <m:sSub>
+          <m:e>
+            <m:r>
+              <w:rPr>
+                <w:rFonts w:ascii="Cambria Math" w:hAnsi="Cambria Math"/>
+              </w:rPr>
+              <m:t xml:space="preserve">H</m:t>
+            </m:r>
+          </m:e>
+          <m:sub>
+            <m:r>
+              <w:rPr>
+                <w:rFonts w:ascii="Cambria Math" w:hAnsi="Cambria Math"/>
+              </w:rPr>
+              <m:t xml:space="preserve">0</m:t>
+            </m:r>
+          </m:sub>
+        </m:sSub>
+      </m:oMath>
+      <w:r>
+        <w:rPr>
+          <w:rFonts w:ascii="Liberation Serif" w:hAnsi="Liberation Serif"/>
+        </w:rPr>
+        <w:t xml:space="preserve"> hipotezini %95 güven düzeyinde reddedilmiştir. Güven aralığından yorumlayacak olursak alt sınır olan 0.4935 ile üst sınır olan 0.580 değer aralığı 0 değerini içermediğinden </w:t>
+      </w:r>
+      <w:r>
+        <w:rPr>
+          <w:rFonts w:ascii="Liberation Serif" w:hAnsi="Liberation Serif"/>
+        </w:rPr>
+      </w:r>
+      <m:oMath xmlns:m="http://schemas.openxmlformats.org/officeDocument/2006/math">
+        <m:sSub>
+          <m:e>
+            <m:r>
+              <w:rPr>
+                <w:rFonts w:ascii="Cambria Math" w:hAnsi="Cambria Math"/>
+              </w:rPr>
+              <m:t xml:space="preserve">H</m:t>
+            </m:r>
+          </m:e>
+          <m:sub>
+            <m:r>
+              <w:rPr>
+                <w:rFonts w:ascii="Cambria Math" w:hAnsi="Cambria Math"/>
+              </w:rPr>
+              <m:t xml:space="preserve">0</m:t>
+            </m:r>
+          </m:sub>
+        </m:sSub>
+      </m:oMath>
+      <w:r>
+        <w:rPr>
+          <w:rFonts w:ascii="Liberation Serif" w:hAnsi="Liberation Serif"/>
+        </w:rPr>
+        <w:t xml:space="preserve"> hipotezi reddedilmiştir. %95 güven düzeyinde yetişkin kadınların ve yetişkin erkeklerin hayatta kalma oranları aynı değildir diyebiliriz.</w:t>
+      </w:r>
+    </w:p>
+    <w:p>
+      <w:pPr>
+        <w:pStyle w:val="Heading2"/>
+        <w:numPr>
+          <w:ilvl w:val="1"/>
+          <w:numId w:val="2"/>
+        </w:numPr>
+        <w:ind w:hanging="0" w:left="0"/>
+        <w:rPr>
+          <w:rFonts w:ascii="Liberation Serif" w:hAnsi="Liberation Serif"/>
+        </w:rPr>
+      </w:pPr>
+      <w:r>
+        <w:rPr>
+          <w:rFonts w:ascii="Liberation Serif" w:hAnsi="Liberation Serif"/>
+        </w:rPr>
+        <w:t>1.4 Bağımlı İki Örneklem Analizi</w:t>
+      </w:r>
+    </w:p>
+    <w:p>
+      <w:pPr>
+        <w:pStyle w:val="BodyText"/>
+        <w:rPr>
+          <w:rFonts w:ascii="Liberation Serif" w:hAnsi="Liberation Serif"/>
+        </w:rPr>
+      </w:pPr>
+      <w:r>
+        <w:rPr>
+          <w:rFonts w:ascii="Liberation Serif" w:hAnsi="Liberation Serif"/>
+        </w:rPr>
+        <w:t xml:space="preserve">Bağımlı iki örneklem analizi için veri seti olarak “sleep” kullanılacaktır. Daha önce verinin tanıtımı yapılmıştır. </w:t>
+      </w:r>
+      <w:r>
+        <w:rPr>
+          <w:rFonts w:eastAsia="Times New Roman" w:cs="Times New Roman" w:ascii="Liberation Serif" w:hAnsi="Liberation Serif" w:cstheme="minorAscii" w:eastAsiaTheme="minorAscii"/>
+          <w:b w:val="false"/>
+          <w:bCs w:val="false"/>
+          <w:i w:val="false"/>
+          <w:iCs w:val="false"/>
+          <w:caps w:val="false"/>
+          <w:smallCaps w:val="false"/>
+          <w:sz w:val="24"/>
+          <w:szCs w:val="24"/>
+          <w:lang w:val="en-US"/>
+        </w:rPr>
+        <w:t>“sleep” veri seti 2 grup öğrenci denek arasında yapılan 2 ilacın uyku sürelerine etkisi üzerine bilgi içermektedir.</w:t>
+      </w:r>
+    </w:p>
+    <w:p>
+      <w:pPr>
+        <w:pStyle w:val="Normal"/>
+        <w:rPr>
+          <w:rFonts w:eastAsia="Times New Roman" w:cs="Times New Roman" w:cstheme="minorAscii" w:eastAsiaTheme="minorAscii"/>
+          <w:i w:val="false"/>
+          <w:iCs w:val="false"/>
+          <w:caps w:val="false"/>
+          <w:smallCaps w:val="false"/>
+          <w:lang w:val="en-US"/>
+        </w:rPr>
+      </w:pPr>
+      <w:r>
+        <w:rPr>
+          <w:rFonts w:ascii="Liberation Serif" w:hAnsi="Liberation Serif"/>
+          <w:b/>
+          <w:bCs/>
+          <w:sz w:val="28"/>
+          <w:szCs w:val="28"/>
+        </w:rPr>
+        <w:t>Verinin basit istatistikleri :</w:t>
+      </w:r>
+    </w:p>
+    <w:p>
+      <w:pPr>
+        <w:pStyle w:val="BodyText"/>
+        <w:rPr>
+          <w:rFonts w:ascii="Liberation Serif" w:hAnsi="Liberation Serif"/>
+        </w:rPr>
+      </w:pPr>
+      <w:r>
+        <w:rPr>
+          <w:rFonts w:eastAsia="Times New Roman" w:cs="Times New Roman" w:ascii="Liberation Serif" w:hAnsi="Liberation Serif" w:cstheme="minorAscii" w:eastAsiaTheme="minorAscii"/>
+          <w:b w:val="false"/>
+          <w:bCs w:val="false"/>
+          <w:i w:val="false"/>
+          <w:iCs w:val="false"/>
+          <w:caps w:val="false"/>
+          <w:smallCaps w:val="false"/>
+          <w:sz w:val="24"/>
+          <w:szCs w:val="24"/>
+          <w:lang w:val="en-US"/>
+        </w:rPr>
+        <w:t xml:space="preserve">1.İlaca ait veriler : </w:t>
+      </w:r>
+      <w:r>
+        <w:rPr>
+          <w:rFonts w:eastAsia="Times New Roman" w:cs="Times New Roman" w:ascii="Liberation Serif" w:hAnsi="Liberation Serif" w:cstheme="minorAscii" w:eastAsiaTheme="minorAscii"/>
+          <w:b w:val="false"/>
+          <w:bCs w:val="false"/>
+          <w:i w:val="false"/>
+          <w:iCs w:val="false"/>
+          <w:caps w:val="false"/>
+          <w:smallCaps w:val="false"/>
+          <w:sz w:val="24"/>
+          <w:szCs w:val="24"/>
+          <w:lang w:val="en-US"/>
+        </w:rPr>
+      </w:r>
+      <m:oMath xmlns:m="http://schemas.openxmlformats.org/officeDocument/2006/math">
+        <m:bar>
+          <m:barPr>
+            <m:pos m:val="top"/>
+          </m:barPr>
+          <m:e>
+            <m:sSub>
+              <m:e>
+                <m:r>
+                  <w:rPr>
+                    <w:rFonts w:ascii="Cambria Math" w:hAnsi="Cambria Math"/>
+                  </w:rPr>
+                  <m:t xml:space="preserve">x</m:t>
+                </m:r>
+              </m:e>
+              <m:sub>
+                <m:r>
+                  <w:rPr>
+                    <w:rFonts w:ascii="Cambria Math" w:hAnsi="Cambria Math"/>
+                  </w:rPr>
+                  <m:t xml:space="preserve">1</m:t>
+                </m:r>
+              </m:sub>
+            </m:sSub>
+          </m:e>
+        </m:bar>
+        <m:r>
+          <w:rPr>
+            <w:rFonts w:ascii="Cambria Math" w:hAnsi="Cambria Math"/>
+          </w:rPr>
+          <m:t xml:space="preserve">=</m:t>
+        </m:r>
+        <m:r>
+          <w:rPr>
+            <w:rFonts w:ascii="Cambria Math" w:hAnsi="Cambria Math"/>
+          </w:rPr>
+          <m:t xml:space="preserve">0.75</m:t>
+        </m:r>
+      </m:oMath>
+      <w:r>
+        <w:rPr>
+          <w:rFonts w:eastAsia="Times New Roman" w:cs="Times New Roman" w:ascii="Liberation Serif" w:hAnsi="Liberation Serif" w:cstheme="minorAscii" w:eastAsiaTheme="minorAscii"/>
+          <w:b w:val="false"/>
+          <w:bCs w:val="false"/>
+          <w:i w:val="false"/>
+          <w:iCs w:val="false"/>
+          <w:caps w:val="false"/>
+          <w:smallCaps w:val="false"/>
+          <w:sz w:val="24"/>
+          <w:szCs w:val="24"/>
+          <w:lang w:val="en-US"/>
+        </w:rPr>
+        <w:tab/>
+        <w:tab/>
+      </w:r>
+      <w:r>
+        <w:rPr>
+          <w:rFonts w:eastAsia="Times New Roman" w:cs="Times New Roman" w:ascii="Liberation Serif" w:hAnsi="Liberation Serif" w:cstheme="minorAscii" w:eastAsiaTheme="minorAscii"/>
+          <w:b w:val="false"/>
+          <w:bCs w:val="false"/>
+          <w:i w:val="false"/>
+          <w:iCs w:val="false"/>
+          <w:caps w:val="false"/>
+          <w:smallCaps w:val="false"/>
+          <w:sz w:val="24"/>
+          <w:szCs w:val="24"/>
+          <w:lang w:val="en-US"/>
+        </w:rPr>
+      </w:r>
+      <m:oMath xmlns:m="http://schemas.openxmlformats.org/officeDocument/2006/math">
+        <m:sSub>
+          <m:e>
+            <m:r>
+              <w:rPr>
+                <w:rFonts w:ascii="Cambria Math" w:hAnsi="Cambria Math"/>
+              </w:rPr>
+              <m:t xml:space="preserve">n</m:t>
+            </m:r>
+          </m:e>
+          <m:sub>
+            <m:r>
+              <w:rPr>
+                <w:rFonts w:ascii="Cambria Math" w:hAnsi="Cambria Math"/>
+              </w:rPr>
+              <m:t xml:space="preserve">1</m:t>
+            </m:r>
+          </m:sub>
+        </m:sSub>
+        <m:r>
+          <w:rPr>
+            <w:rFonts w:ascii="Cambria Math" w:hAnsi="Cambria Math"/>
+          </w:rPr>
+          <m:t xml:space="preserve">=</m:t>
+        </m:r>
+        <m:r>
+          <w:rPr>
+            <w:rFonts w:ascii="Cambria Math" w:hAnsi="Cambria Math"/>
+          </w:rPr>
+          <m:t xml:space="preserve">10</m:t>
+        </m:r>
+      </m:oMath>
+      <w:r>
+        <w:rPr>
+          <w:rFonts w:eastAsia="Times New Roman" w:cs="Times New Roman" w:ascii="Liberation Serif" w:hAnsi="Liberation Serif" w:cstheme="minorAscii" w:eastAsiaTheme="minorAscii"/>
+          <w:b w:val="false"/>
+          <w:bCs w:val="false"/>
+          <w:i w:val="false"/>
+          <w:iCs w:val="false"/>
+          <w:caps w:val="false"/>
+          <w:smallCaps w:val="false"/>
+          <w:sz w:val="24"/>
+          <w:szCs w:val="24"/>
+          <w:lang w:val="en-US"/>
+        </w:rPr>
+        <w:t xml:space="preserve"> </w:t>
+        <w:tab/>
+        <w:tab/>
+      </w:r>
+      <w:r>
+        <w:rPr>
+          <w:rFonts w:eastAsia="Times New Roman" w:cs="Times New Roman" w:ascii="Liberation Serif" w:hAnsi="Liberation Serif" w:cstheme="minorAscii" w:eastAsiaTheme="minorAscii"/>
+          <w:b w:val="false"/>
+          <w:bCs w:val="false"/>
+          <w:i w:val="false"/>
+          <w:iCs w:val="false"/>
+          <w:caps w:val="false"/>
+          <w:smallCaps w:val="false"/>
+          <w:sz w:val="24"/>
+          <w:szCs w:val="24"/>
+          <w:lang w:val="en-US"/>
+        </w:rPr>
+      </w:r>
+      <m:oMath xmlns:m="http://schemas.openxmlformats.org/officeDocument/2006/math">
+        <m:sSubSup>
+          <m:e>
+            <m:r>
+              <w:rPr>
+                <w:rFonts w:ascii="Cambria Math" w:hAnsi="Cambria Math"/>
+              </w:rPr>
+              <m:t xml:space="preserve">S</m:t>
+            </m:r>
+          </m:e>
+          <m:sub>
+            <m:r>
+              <w:rPr>
+                <w:rFonts w:ascii="Cambria Math" w:hAnsi="Cambria Math"/>
+              </w:rPr>
+              <m:t xml:space="preserve">1</m:t>
+            </m:r>
+          </m:sub>
+          <m:sup>
+            <m:r>
+              <w:rPr>
+                <w:rFonts w:ascii="Cambria Math" w:hAnsi="Cambria Math"/>
+              </w:rPr>
+              <m:t xml:space="preserve">2</m:t>
+            </m:r>
+          </m:sup>
+        </m:sSubSup>
+        <m:r>
+          <w:rPr>
+            <w:rFonts w:ascii="Cambria Math" w:hAnsi="Cambria Math"/>
+          </w:rPr>
+          <m:t xml:space="preserve">=</m:t>
+        </m:r>
+        <m:r>
+          <w:rPr>
+            <w:rFonts w:ascii="Cambria Math" w:hAnsi="Cambria Math"/>
+          </w:rPr>
+          <m:t xml:space="preserve">3.20</m:t>
+        </m:r>
+      </m:oMath>
+    </w:p>
+    <w:p>
+      <w:pPr>
+        <w:pStyle w:val="BodyText"/>
+        <w:rPr>
+          <w:rFonts w:ascii="Liberation Serif" w:hAnsi="Liberation Serif"/>
+        </w:rPr>
+      </w:pPr>
+      <w:r>
+        <w:rPr>
+          <w:rFonts w:eastAsia="Times New Roman" w:cs="Times New Roman" w:ascii="Liberation Serif" w:hAnsi="Liberation Serif" w:cstheme="minorAscii" w:eastAsiaTheme="minorAscii"/>
+          <w:b w:val="false"/>
+          <w:bCs w:val="false"/>
+          <w:i w:val="false"/>
+          <w:iCs w:val="false"/>
+          <w:caps w:val="false"/>
+          <w:smallCaps w:val="false"/>
+          <w:sz w:val="24"/>
+          <w:szCs w:val="24"/>
+          <w:lang w:val="en-US"/>
+        </w:rPr>
+        <w:t>2.İlaca ait veriler :</w:t>
+      </w:r>
+      <w:r>
+        <w:rPr>
+          <w:rFonts w:eastAsia="Times New Roman" w:cs="Times New Roman" w:ascii="Liberation Serif" w:hAnsi="Liberation Serif" w:cstheme="minorAscii" w:eastAsiaTheme="minorAscii"/>
+          <w:b w:val="false"/>
+          <w:bCs w:val="false"/>
+          <w:i w:val="false"/>
+          <w:iCs w:val="false"/>
+          <w:caps w:val="false"/>
+          <w:smallCaps w:val="false"/>
+          <w:sz w:val="24"/>
+          <w:szCs w:val="24"/>
+          <w:lang w:val="en-US"/>
+        </w:rPr>
+      </w:r>
+      <m:oMath xmlns:m="http://schemas.openxmlformats.org/officeDocument/2006/math">
+        <m:bar>
+          <m:barPr>
+            <m:pos m:val="top"/>
+          </m:barPr>
+          <m:e>
+            <m:sSub>
+              <m:e>
+                <m:r>
+                  <w:rPr>
+                    <w:rFonts w:ascii="Cambria Math" w:hAnsi="Cambria Math"/>
+                  </w:rPr>
+                  <m:t xml:space="preserve">x</m:t>
+                </m:r>
+              </m:e>
+              <m:sub>
+                <m:r>
+                  <w:rPr>
+                    <w:rFonts w:ascii="Cambria Math" w:hAnsi="Cambria Math"/>
+                  </w:rPr>
+                  <m:t xml:space="preserve">2</m:t>
+                </m:r>
+              </m:sub>
+            </m:sSub>
+          </m:e>
+        </m:bar>
+        <m:r>
+          <w:rPr>
+            <w:rFonts w:ascii="Cambria Math" w:hAnsi="Cambria Math"/>
+          </w:rPr>
+          <m:t xml:space="preserve">=</m:t>
+        </m:r>
+        <m:r>
+          <w:rPr>
+            <w:rFonts w:ascii="Cambria Math" w:hAnsi="Cambria Math"/>
+          </w:rPr>
+          <m:t xml:space="preserve">2.33</m:t>
+        </m:r>
+      </m:oMath>
+      <w:r>
+        <w:rPr>
+          <w:rFonts w:eastAsia="Times New Roman" w:cs="Times New Roman" w:ascii="Liberation Serif" w:hAnsi="Liberation Serif" w:cstheme="minorAscii" w:eastAsiaTheme="minorAscii"/>
+          <w:b w:val="false"/>
+          <w:bCs w:val="false"/>
+          <w:i w:val="false"/>
+          <w:iCs w:val="false"/>
+          <w:caps w:val="false"/>
+          <w:smallCaps w:val="false"/>
+          <w:sz w:val="24"/>
+          <w:szCs w:val="24"/>
+          <w:lang w:val="en-US"/>
+        </w:rPr>
+        <w:tab/>
+        <w:tab/>
+      </w:r>
+      <w:r>
+        <w:rPr>
+          <w:rFonts w:eastAsia="Times New Roman" w:cs="Times New Roman" w:ascii="Liberation Serif" w:hAnsi="Liberation Serif" w:cstheme="minorAscii" w:eastAsiaTheme="minorAscii"/>
+          <w:b w:val="false"/>
+          <w:bCs w:val="false"/>
+          <w:i w:val="false"/>
+          <w:iCs w:val="false"/>
+          <w:caps w:val="false"/>
+          <w:smallCaps w:val="false"/>
+          <w:sz w:val="24"/>
+          <w:szCs w:val="24"/>
+          <w:lang w:val="en-US"/>
+        </w:rPr>
+      </w:r>
+      <m:oMath xmlns:m="http://schemas.openxmlformats.org/officeDocument/2006/math">
+        <m:sSub>
+          <m:e>
+            <m:r>
+              <w:rPr>
+                <w:rFonts w:ascii="Cambria Math" w:hAnsi="Cambria Math"/>
+              </w:rPr>
+              <m:t xml:space="preserve">n</m:t>
+            </m:r>
+          </m:e>
+          <m:sub>
+            <m:r>
+              <w:rPr>
+                <w:rFonts w:ascii="Cambria Math" w:hAnsi="Cambria Math"/>
+              </w:rPr>
+              <m:t xml:space="preserve">2</m:t>
+            </m:r>
+          </m:sub>
+        </m:sSub>
+        <m:r>
+          <w:rPr>
+            <w:rFonts w:ascii="Cambria Math" w:hAnsi="Cambria Math"/>
+          </w:rPr>
+          <m:t xml:space="preserve">=</m:t>
+        </m:r>
+        <m:r>
+          <w:rPr>
+            <w:rFonts w:ascii="Cambria Math" w:hAnsi="Cambria Math"/>
+          </w:rPr>
+          <m:t xml:space="preserve">10</m:t>
+        </m:r>
+      </m:oMath>
+      <w:r>
+        <w:rPr>
+          <w:rFonts w:eastAsia="Times New Roman" w:cs="Times New Roman" w:ascii="Liberation Serif" w:hAnsi="Liberation Serif" w:cstheme="minorAscii" w:eastAsiaTheme="minorAscii"/>
+          <w:b w:val="false"/>
+          <w:bCs w:val="false"/>
+          <w:i w:val="false"/>
+          <w:iCs w:val="false"/>
+          <w:caps w:val="false"/>
+          <w:smallCaps w:val="false"/>
+          <w:sz w:val="24"/>
+          <w:szCs w:val="24"/>
+          <w:lang w:val="en-US"/>
+        </w:rPr>
+        <w:tab/>
+        <w:tab/>
+      </w:r>
+      <w:r>
+        <w:rPr>
+          <w:rFonts w:eastAsia="Times New Roman" w:cs="Times New Roman" w:ascii="Liberation Serif" w:hAnsi="Liberation Serif" w:cstheme="minorAscii" w:eastAsiaTheme="minorAscii"/>
+          <w:b w:val="false"/>
+          <w:bCs w:val="false"/>
+          <w:i w:val="false"/>
+          <w:iCs w:val="false"/>
+          <w:caps w:val="false"/>
+          <w:smallCaps w:val="false"/>
+          <w:sz w:val="24"/>
+          <w:szCs w:val="24"/>
+          <w:lang w:val="en-US"/>
+        </w:rPr>
+      </w:r>
+      <m:oMath xmlns:m="http://schemas.openxmlformats.org/officeDocument/2006/math">
+        <m:sSubSup>
+          <m:e>
+            <m:r>
+              <w:rPr>
+                <w:rFonts w:ascii="Cambria Math" w:hAnsi="Cambria Math"/>
+              </w:rPr>
+              <m:t xml:space="preserve">S</m:t>
+            </m:r>
+          </m:e>
+          <m:sub>
+            <m:r>
+              <w:rPr>
+                <w:rFonts w:ascii="Cambria Math" w:hAnsi="Cambria Math"/>
+              </w:rPr>
+              <m:t xml:space="preserve">2</m:t>
+            </m:r>
+          </m:sub>
+          <m:sup>
+            <m:r>
+              <w:rPr>
+                <w:rFonts w:ascii="Cambria Math" w:hAnsi="Cambria Math"/>
+              </w:rPr>
+              <m:t xml:space="preserve">2</m:t>
+            </m:r>
+          </m:sup>
+        </m:sSubSup>
+        <m:r>
+          <w:rPr>
+            <w:rFonts w:ascii="Cambria Math" w:hAnsi="Cambria Math"/>
+          </w:rPr>
+          <m:t xml:space="preserve">=</m:t>
+        </m:r>
+        <m:r>
+          <w:rPr>
+            <w:rFonts w:ascii="Cambria Math" w:hAnsi="Cambria Math"/>
+          </w:rPr>
+          <m:t xml:space="preserve">4.01</m:t>
+        </m:r>
+      </m:oMath>
     </w:p>
     <w:p>
       <w:pPr>
         <w:pStyle w:val="BodyText"/>
         <w:spacing w:before="0" w:after="140"/>
         <w:rPr>
-          <w:rFonts w:ascii="Liberation Serif" w:hAnsi="Liberation Serif"/>
-        </w:rPr>
-      </w:pPr>
-      <w:r>
-        <w:rPr>
-          <w:rFonts w:ascii="Liberation Serif" w:hAnsi="Liberation Serif"/>
-        </w:rPr>
+          <w:rFonts w:ascii="Liberation Serif" w:hAnsi="Liberation Serif" w:eastAsia="Times New Roman" w:cs="Times New Roman" w:cstheme="minorAscii" w:eastAsiaTheme="minorAscii"/>
+          <w:b w:val="false"/>
+          <w:bCs w:val="false"/>
+          <w:i w:val="false"/>
+          <w:iCs w:val="false"/>
+          <w:caps w:val="false"/>
+          <w:smallCaps w:val="false"/>
+          <w:sz w:val="24"/>
+          <w:szCs w:val="24"/>
+          <w:lang w:val="en-US"/>
+        </w:rPr>
+      </w:pPr>
+      <w:r>
+        <w:rPr>
+          <w:rFonts w:eastAsia="Times New Roman" w:cs="Times New Roman" w:cstheme="minorAscii" w:eastAsiaTheme="minorAscii" w:ascii="Liberation Serif" w:hAnsi="Liberation Serif"/>
+          <w:b w:val="false"/>
+          <w:bCs w:val="false"/>
+          <w:i w:val="false"/>
+          <w:iCs w:val="false"/>
+          <w:caps w:val="false"/>
+          <w:smallCaps w:val="false"/>
+          <w:sz w:val="24"/>
+          <w:szCs w:val="24"/>
+          <w:lang w:val="en-US"/>
+        </w:rPr>
+        <w:drawing>
+          <wp:inline distT="0" distB="0" distL="0" distR="0">
+            <wp:extent cx="3075940" cy="571500"/>
+            <wp:effectExtent l="0" t="0" r="0" b="0"/>
+            <wp:docPr id="11" name="Görüntü11"/>
+            <wp:cNvGraphicFramePr>
+              <a:graphicFrameLocks xmlns:a="http://schemas.openxmlformats.org/drawingml/2006/main" noChangeAspect="1"/>
+            </wp:cNvGraphicFramePr>
+            <a:graphic xmlns:a="http://schemas.openxmlformats.org/drawingml/2006/main">
+              <a:graphicData uri="http://schemas.openxmlformats.org/drawingml/2006/picture">
+                <pic:pic xmlns:pic="http://schemas.openxmlformats.org/drawingml/2006/picture">
+                  <pic:nvPicPr>
+                    <pic:cNvPr id="11" name="Görüntü11"/>
+                    <pic:cNvPicPr>
+                      <a:picLocks noChangeAspect="1" noChangeArrowheads="1"/>
+                    </pic:cNvPicPr>
+                  </pic:nvPicPr>
+                  <pic:blipFill>
+                    <a:blip r:embed="rId14"/>
+                    <a:stretch>
+                      <a:fillRect/>
+                    </a:stretch>
+                  </pic:blipFill>
+                  <pic:spPr bwMode="auto">
+                    <a:xfrm>
+                      <a:off x="0" y="0"/>
+                      <a:ext cx="3075940" cy="571500"/>
+                    </a:xfrm>
+                    <a:prstGeom prst="rect">
+                      <a:avLst/>
+                    </a:prstGeom>
+                    <a:noFill/>
+                  </pic:spPr>
+                </pic:pic>
+              </a:graphicData>
+            </a:graphic>
+          </wp:inline>
+        </w:drawing>
+      </w:r>
+      <w:r>
+        <w:rPr>
+          <w:rFonts w:eastAsia="Times New Roman" w:cs="Times New Roman" w:cstheme="minorAscii" w:eastAsiaTheme="minorAscii" w:ascii="Liberation Serif" w:hAnsi="Liberation Serif"/>
+          <w:b w:val="false"/>
+          <w:bCs w:val="false"/>
+          <w:i w:val="false"/>
+          <w:iCs w:val="false"/>
+          <w:caps w:val="false"/>
+          <w:smallCaps w:val="false"/>
+          <w:sz w:val="24"/>
+          <w:szCs w:val="24"/>
+          <w:lang w:val="en-US"/>
+        </w:rPr>
+        <w:drawing>
+          <wp:inline distT="0" distB="0" distL="0" distR="0">
+            <wp:extent cx="2499360" cy="1086485"/>
+            <wp:effectExtent l="0" t="0" r="0" b="0"/>
+            <wp:docPr id="12" name="Görüntü12"/>
+            <wp:cNvGraphicFramePr>
+              <a:graphicFrameLocks xmlns:a="http://schemas.openxmlformats.org/drawingml/2006/main" noChangeAspect="1"/>
+            </wp:cNvGraphicFramePr>
+            <a:graphic xmlns:a="http://schemas.openxmlformats.org/drawingml/2006/main">
+              <a:graphicData uri="http://schemas.openxmlformats.org/drawingml/2006/picture">
+                <pic:pic xmlns:pic="http://schemas.openxmlformats.org/drawingml/2006/picture">
+                  <pic:nvPicPr>
+                    <pic:cNvPr id="12" name="Görüntü12"/>
+                    <pic:cNvPicPr>
+                      <a:picLocks noChangeAspect="1" noChangeArrowheads="1"/>
+                    </pic:cNvPicPr>
+                  </pic:nvPicPr>
+                  <pic:blipFill>
+                    <a:blip r:embed="rId15"/>
+                    <a:stretch>
+                      <a:fillRect/>
+                    </a:stretch>
+                  </pic:blipFill>
+                  <pic:spPr bwMode="auto">
+                    <a:xfrm>
+                      <a:off x="0" y="0"/>
+                      <a:ext cx="2499360" cy="1086485"/>
+                    </a:xfrm>
+                    <a:prstGeom prst="rect">
+                      <a:avLst/>
+                    </a:prstGeom>
+                    <a:noFill/>
+                  </pic:spPr>
+                </pic:pic>
+              </a:graphicData>
+            </a:graphic>
+          </wp:inline>
+        </w:drawing>
+      </w:r>
+    </w:p>
+    <w:p>
+      <w:pPr>
+        <w:pStyle w:val="BodyText"/>
+        <w:spacing w:before="0" w:after="140"/>
+        <w:rPr>
+          <w:rFonts w:ascii="Liberation Serif" w:hAnsi="Liberation Serif"/>
+        </w:rPr>
+      </w:pPr>
+      <w:r>
+        <w:rPr>
+          <w:rFonts w:eastAsia="Times New Roman" w:cs="Times New Roman" w:ascii="Liberation Serif" w:hAnsi="Liberation Serif" w:cstheme="minorAscii" w:eastAsiaTheme="minorAscii"/>
+          <w:b w:val="false"/>
+          <w:bCs w:val="false"/>
+          <w:i w:val="false"/>
+          <w:iCs w:val="false"/>
+          <w:caps w:val="false"/>
+          <w:smallCaps w:val="false"/>
+          <w:sz w:val="24"/>
+          <w:szCs w:val="24"/>
+          <w:lang w:val="en-US"/>
+        </w:rPr>
+        <w:t>Bağımlı iki örneklem t-testine geçilmeden önce grupların betimleyici istatistikleri incelenmiştir. Yapılan incelemede, 1. ilacı alan 10 hastanın uyku süresindeki ortalama artış 0.75 saat (</w:t>
+      </w:r>
+      <w:r>
+        <w:rPr>
+          <w:rFonts w:ascii="Liberation Serif" w:hAnsi="Liberation Serif"/>
+        </w:rPr>
+      </w:r>
+      <m:oMath xmlns:m="http://schemas.openxmlformats.org/officeDocument/2006/math">
+        <m:sSubSup>
+          <m:e>
+            <m:r>
+              <w:rPr>
+                <w:rFonts w:ascii="Cambria Math" w:hAnsi="Cambria Math"/>
+              </w:rPr>
+              <m:t xml:space="preserve">S</m:t>
+            </m:r>
+          </m:e>
+          <m:sub>
+            <m:r>
+              <w:rPr>
+                <w:rFonts w:ascii="Cambria Math" w:hAnsi="Cambria Math"/>
+              </w:rPr>
+              <m:t xml:space="preserve">1</m:t>
+            </m:r>
+          </m:sub>
+          <m:sup>
+            <m:r>
+              <w:rPr>
+                <w:rFonts w:ascii="Cambria Math" w:hAnsi="Cambria Math"/>
+              </w:rPr>
+              <m:t xml:space="preserve">2</m:t>
+            </m:r>
+          </m:sup>
+        </m:sSubSup>
+        <m:r>
+          <m:rPr>
+            <m:lit/>
+            <m:nor/>
+          </m:rPr>
+          <w:rPr>
+            <w:rFonts w:ascii="Cambria Math" w:hAnsi="Cambria Math"/>
+          </w:rPr>
+          <m:t xml:space="preserve">=</m:t>
+        </m:r>
+        <m:r>
+          <w:rPr>
+            <w:rFonts w:ascii="Cambria Math" w:hAnsi="Cambria Math"/>
+          </w:rPr>
+          <m:t xml:space="preserve">3.20</m:t>
+        </m:r>
+      </m:oMath>
+      <w:r>
+        <w:rPr>
+          <w:rFonts w:eastAsia="Times New Roman" w:cs="Times New Roman" w:ascii="Liberation Serif" w:hAnsi="Liberation Serif" w:cstheme="minorAscii" w:eastAsiaTheme="minorAscii"/>
+          <w:b w:val="false"/>
+          <w:bCs w:val="false"/>
+          <w:i w:val="false"/>
+          <w:iCs w:val="false"/>
+          <w:caps w:val="false"/>
+          <w:smallCaps w:val="false"/>
+          <w:sz w:val="24"/>
+          <w:szCs w:val="24"/>
+          <w:lang w:val="en-US"/>
+        </w:rPr>
+        <w:t>) olarak gözlemlenirken; aynı 10 hastanın 2. ilacı aldığındaki ortalama uyku süresi artışının 2.33 saate (</w:t>
+      </w:r>
+      <w:r>
+        <w:rPr>
+          <w:rFonts w:ascii="Liberation Serif" w:hAnsi="Liberation Serif"/>
+        </w:rPr>
+      </w:r>
+      <m:oMath xmlns:m="http://schemas.openxmlformats.org/officeDocument/2006/math">
+        <m:sSubSup>
+          <m:e>
+            <m:r>
+              <w:rPr>
+                <w:rFonts w:ascii="Cambria Math" w:hAnsi="Cambria Math"/>
+              </w:rPr>
+              <m:t xml:space="preserve">S</m:t>
+            </m:r>
+          </m:e>
+          <m:sub>
+            <m:r>
+              <w:rPr>
+                <w:rFonts w:ascii="Cambria Math" w:hAnsi="Cambria Math"/>
+              </w:rPr>
+              <m:t xml:space="preserve">2</m:t>
+            </m:r>
+          </m:sub>
+          <m:sup>
+            <m:r>
+              <w:rPr>
+                <w:rFonts w:ascii="Cambria Math" w:hAnsi="Cambria Math"/>
+              </w:rPr>
+              <m:t xml:space="preserve">2</m:t>
+            </m:r>
+          </m:sup>
+        </m:sSubSup>
+        <m:r>
+          <m:rPr>
+            <m:lit/>
+            <m:nor/>
+          </m:rPr>
+          <w:rPr>
+            <w:rFonts w:ascii="Cambria Math" w:hAnsi="Cambria Math"/>
+          </w:rPr>
+          <m:t xml:space="preserve">=</m:t>
+        </m:r>
+        <m:r>
+          <w:rPr>
+            <w:rFonts w:ascii="Cambria Math" w:hAnsi="Cambria Math"/>
+          </w:rPr>
+          <m:t xml:space="preserve">4.01</m:t>
+        </m:r>
+      </m:oMath>
+      <w:r>
+        <w:rPr>
+          <w:rFonts w:eastAsia="Times New Roman" w:cs="Times New Roman" w:ascii="Liberation Serif" w:hAnsi="Liberation Serif" w:cstheme="minorAscii" w:eastAsiaTheme="minorAscii"/>
+          <w:b w:val="false"/>
+          <w:bCs w:val="false"/>
+          <w:i w:val="false"/>
+          <w:iCs w:val="false"/>
+          <w:caps w:val="false"/>
+          <w:smallCaps w:val="false"/>
+          <w:sz w:val="24"/>
+          <w:szCs w:val="24"/>
+          <w:lang w:val="en-US"/>
+        </w:rPr>
+        <w:t>) yükseldiği tespit edilmiştir. Bu betimleyici farkın istatistiksel olarak anlamlı olup olmadığını belirlemek amacıyla eşleştirilmiş t-testi (paired t-test) uygulan</w:t>
+      </w:r>
+      <w:r>
+        <w:rPr>
+          <w:rFonts w:eastAsia="Times New Roman" w:cs="Times New Roman" w:ascii="Liberation Serif" w:hAnsi="Liberation Serif" w:cstheme="minorAscii" w:eastAsiaTheme="minorAscii"/>
+          <w:b w:val="false"/>
+          <w:bCs w:val="false"/>
+          <w:i w:val="false"/>
+          <w:iCs w:val="false"/>
+          <w:caps w:val="false"/>
+          <w:smallCaps w:val="false"/>
+          <w:sz w:val="24"/>
+          <w:szCs w:val="24"/>
+          <w:lang w:val="en-US"/>
+        </w:rPr>
+        <w:t>a</w:t>
+      </w:r>
+      <w:r>
+        <w:rPr>
+          <w:rFonts w:eastAsia="Times New Roman" w:cs="Times New Roman" w:ascii="Liberation Serif" w:hAnsi="Liberation Serif" w:cstheme="minorAscii" w:eastAsiaTheme="minorAscii"/>
+          <w:b w:val="false"/>
+          <w:bCs w:val="false"/>
+          <w:i w:val="false"/>
+          <w:iCs w:val="false"/>
+          <w:caps w:val="false"/>
+          <w:smallCaps w:val="false"/>
+          <w:sz w:val="24"/>
+          <w:szCs w:val="24"/>
+          <w:lang w:val="en-US"/>
+        </w:rPr>
+        <w:t>c</w:t>
+      </w:r>
+      <w:r>
+        <w:rPr>
+          <w:rFonts w:eastAsia="Times New Roman" w:cs="Times New Roman" w:ascii="Liberation Serif" w:hAnsi="Liberation Serif" w:cstheme="minorAscii" w:eastAsiaTheme="minorAscii"/>
+          <w:b w:val="false"/>
+          <w:bCs w:val="false"/>
+          <w:i w:val="false"/>
+          <w:iCs w:val="false"/>
+          <w:caps w:val="false"/>
+          <w:smallCaps w:val="false"/>
+          <w:sz w:val="24"/>
+          <w:szCs w:val="24"/>
+          <w:lang w:val="en-US"/>
+        </w:rPr>
+        <w:t>a</w:t>
+      </w:r>
+      <w:r>
+        <w:rPr>
+          <w:rFonts w:eastAsia="Times New Roman" w:cs="Times New Roman" w:ascii="Liberation Serif" w:hAnsi="Liberation Serif" w:cstheme="minorAscii" w:eastAsiaTheme="minorAscii"/>
+          <w:b w:val="false"/>
+          <w:bCs w:val="false"/>
+          <w:i w:val="false"/>
+          <w:iCs w:val="false"/>
+          <w:caps w:val="false"/>
+          <w:smallCaps w:val="false"/>
+          <w:sz w:val="24"/>
+          <w:szCs w:val="24"/>
+          <w:lang w:val="en-US"/>
+        </w:rPr>
+        <w:t>k</w:t>
+      </w:r>
+      <w:r>
+        <w:rPr>
+          <w:rFonts w:eastAsia="Times New Roman" w:cs="Times New Roman" w:ascii="Liberation Serif" w:hAnsi="Liberation Serif" w:cstheme="minorAscii" w:eastAsiaTheme="minorAscii"/>
+          <w:b w:val="false"/>
+          <w:bCs w:val="false"/>
+          <w:i w:val="false"/>
+          <w:iCs w:val="false"/>
+          <w:caps w:val="false"/>
+          <w:smallCaps w:val="false"/>
+          <w:sz w:val="24"/>
+          <w:szCs w:val="24"/>
+          <w:lang w:val="en-US"/>
+        </w:rPr>
+        <w:t>t</w:t>
+      </w:r>
+      <w:r>
+        <w:rPr>
+          <w:rFonts w:eastAsia="Times New Roman" w:cs="Times New Roman" w:ascii="Liberation Serif" w:hAnsi="Liberation Serif" w:cstheme="minorAscii" w:eastAsiaTheme="minorAscii"/>
+          <w:b w:val="false"/>
+          <w:bCs w:val="false"/>
+          <w:i w:val="false"/>
+          <w:iCs w:val="false"/>
+          <w:caps w:val="false"/>
+          <w:smallCaps w:val="false"/>
+          <w:sz w:val="24"/>
+          <w:szCs w:val="24"/>
+          <w:lang w:val="en-US"/>
+        </w:rPr>
+        <w:t>ı</w:t>
+      </w:r>
+      <w:r>
+        <w:rPr>
+          <w:rFonts w:eastAsia="Times New Roman" w:cs="Times New Roman" w:ascii="Liberation Serif" w:hAnsi="Liberation Serif" w:cstheme="minorAscii" w:eastAsiaTheme="minorAscii"/>
+          <w:b w:val="false"/>
+          <w:bCs w:val="false"/>
+          <w:i w:val="false"/>
+          <w:iCs w:val="false"/>
+          <w:caps w:val="false"/>
+          <w:smallCaps w:val="false"/>
+          <w:sz w:val="24"/>
+          <w:szCs w:val="24"/>
+          <w:lang w:val="en-US"/>
+        </w:rPr>
+        <w:t>r</w:t>
+      </w:r>
+      <w:r>
+        <w:rPr>
+          <w:rFonts w:eastAsia="Times New Roman" w:cs="Times New Roman" w:ascii="Liberation Serif" w:hAnsi="Liberation Serif" w:cstheme="minorAscii" w:eastAsiaTheme="minorAscii"/>
+          <w:b w:val="false"/>
+          <w:bCs w:val="false"/>
+          <w:i w:val="false"/>
+          <w:iCs w:val="false"/>
+          <w:caps w:val="false"/>
+          <w:smallCaps w:val="false"/>
+          <w:sz w:val="24"/>
+          <w:szCs w:val="24"/>
+          <w:lang w:val="en-US"/>
+        </w:rPr>
+        <w:t>.</w:t>
+      </w:r>
+    </w:p>
+    <w:p>
+      <w:pPr>
+        <w:pStyle w:val="BodyText"/>
+        <w:spacing w:before="0" w:after="140"/>
+        <w:rPr>
+          <w:rFonts w:ascii="Liberation Serif" w:hAnsi="Liberation Serif" w:eastAsia="Times New Roman" w:cs="Times New Roman" w:cstheme="minorAscii" w:eastAsiaTheme="minorAscii"/>
+          <w:b w:val="false"/>
+          <w:bCs w:val="false"/>
+          <w:i w:val="false"/>
+          <w:iCs w:val="false"/>
+          <w:caps w:val="false"/>
+          <w:smallCaps w:val="false"/>
+          <w:sz w:val="24"/>
+          <w:szCs w:val="24"/>
+          <w:lang w:val="en-US"/>
+        </w:rPr>
+      </w:pPr>
+      <w:r>
+        <w:rPr>
+          <w:rFonts w:eastAsia="Times New Roman" w:cs="Times New Roman" w:cstheme="minorAscii" w:eastAsiaTheme="minorAscii" w:ascii="Liberation Serif" w:hAnsi="Liberation Serif"/>
+          <w:b w:val="false"/>
+          <w:bCs w:val="false"/>
+          <w:i w:val="false"/>
+          <w:iCs w:val="false"/>
+          <w:caps w:val="false"/>
+          <w:smallCaps w:val="false"/>
+          <w:sz w:val="24"/>
+          <w:szCs w:val="24"/>
+          <w:lang w:val="en-US"/>
+        </w:rPr>
+        <w:t xml:space="preserve">2. uyku ilacının 1.uyku ilacından farklı </w:t>
+      </w:r>
+      <w:r>
+        <w:rPr>
+          <w:rFonts w:eastAsia="Times New Roman" w:cs="Times New Roman" w:cstheme="minorAscii" w:eastAsiaTheme="minorAscii" w:ascii="Liberation Serif" w:hAnsi="Liberation Serif"/>
+          <w:b w:val="false"/>
+          <w:bCs w:val="false"/>
+          <w:i w:val="false"/>
+          <w:iCs w:val="false"/>
+          <w:caps w:val="false"/>
+          <w:smallCaps w:val="false"/>
+          <w:sz w:val="24"/>
+          <w:szCs w:val="24"/>
+          <w:lang w:val="en-US"/>
+        </w:rPr>
+        <w:t>olup olmadığına</w:t>
+      </w:r>
+      <w:r>
+        <w:rPr>
+          <w:rFonts w:eastAsia="Times New Roman" w:cs="Times New Roman" w:cstheme="minorAscii" w:eastAsiaTheme="minorAscii" w:ascii="Liberation Serif" w:hAnsi="Liberation Serif"/>
+          <w:b w:val="false"/>
+          <w:bCs w:val="false"/>
+          <w:i w:val="false"/>
+          <w:iCs w:val="false"/>
+          <w:caps w:val="false"/>
+          <w:smallCaps w:val="false"/>
+          <w:sz w:val="24"/>
+          <w:szCs w:val="24"/>
+          <w:lang w:val="en-US"/>
+        </w:rPr>
+        <w:t xml:space="preserve"> dair hipotez :</w:t>
+      </w:r>
+    </w:p>
+    <w:p>
+      <w:pPr>
+        <w:pStyle w:val="BodyText"/>
+        <w:spacing w:before="0" w:after="140"/>
+        <w:rPr>
+          <w:rFonts w:ascii="Liberation Serif" w:hAnsi="Liberation Serif" w:eastAsia="Times New Roman" w:cs="Times New Roman" w:cstheme="minorAscii" w:eastAsiaTheme="minorAscii"/>
+          <w:b w:val="false"/>
+          <w:bCs w:val="false"/>
+          <w:i w:val="false"/>
+          <w:iCs w:val="false"/>
+          <w:caps w:val="false"/>
+          <w:smallCaps w:val="false"/>
+          <w:sz w:val="24"/>
+          <w:szCs w:val="24"/>
+          <w:lang w:val="en-US"/>
+        </w:rPr>
+      </w:pPr>
+      <w:r>
+        <w:rPr>
+          <w:rFonts w:eastAsia="Times New Roman" w:cs="Times New Roman" w:cstheme="minorAscii" w:eastAsiaTheme="minorAscii" w:ascii="Liberation Serif" w:hAnsi="Liberation Serif"/>
+          <w:b w:val="false"/>
+          <w:bCs w:val="false"/>
+          <w:i w:val="false"/>
+          <w:iCs w:val="false"/>
+          <w:caps w:val="false"/>
+          <w:smallCaps w:val="false"/>
+          <w:sz w:val="24"/>
+          <w:szCs w:val="24"/>
+          <w:lang w:val="en-US"/>
+        </w:rPr>
+      </w:r>
+      <m:oMath xmlns:m="http://schemas.openxmlformats.org/officeDocument/2006/math">
+        <m:sSub>
+          <m:e>
+            <m:r>
+              <w:rPr>
+                <w:rFonts w:ascii="Cambria Math" w:hAnsi="Cambria Math"/>
+              </w:rPr>
+              <m:t xml:space="preserve">H</m:t>
+            </m:r>
+          </m:e>
+          <m:sub>
+            <m:r>
+              <w:rPr>
+                <w:rFonts w:ascii="Cambria Math" w:hAnsi="Cambria Math"/>
+              </w:rPr>
+              <m:t xml:space="preserve">0</m:t>
+            </m:r>
+          </m:sub>
+        </m:sSub>
+        <m:r>
+          <w:rPr>
+            <w:rFonts w:ascii="Cambria Math" w:hAnsi="Cambria Math"/>
+          </w:rPr>
+          <m:t xml:space="preserve">:</m:t>
+        </m:r>
+        <m:sSub>
+          <m:e>
+            <m:r>
+              <w:rPr>
+                <w:rFonts w:ascii="Cambria Math" w:hAnsi="Cambria Math"/>
+              </w:rPr>
+              <m:t xml:space="preserve">μ</m:t>
+            </m:r>
+          </m:e>
+          <m:sub>
+            <m:r>
+              <w:rPr>
+                <w:rFonts w:ascii="Cambria Math" w:hAnsi="Cambria Math"/>
+              </w:rPr>
+              <m:t xml:space="preserve">1</m:t>
+            </m:r>
+          </m:sub>
+        </m:sSub>
+        <m:r>
+          <w:rPr>
+            <w:rFonts w:ascii="Cambria Math" w:hAnsi="Cambria Math"/>
+          </w:rPr>
+          <m:t xml:space="preserve">=</m:t>
+        </m:r>
+        <m:sSub>
+          <m:e>
+            <m:r>
+              <w:rPr>
+                <w:rFonts w:ascii="Cambria Math" w:hAnsi="Cambria Math"/>
+              </w:rPr>
+              <m:t xml:space="preserve">μ</m:t>
+            </m:r>
+          </m:e>
+          <m:sub>
+            <m:r>
+              <w:rPr>
+                <w:rFonts w:ascii="Cambria Math" w:hAnsi="Cambria Math"/>
+              </w:rPr>
+              <m:t xml:space="preserve">2</m:t>
+            </m:r>
+          </m:sub>
+        </m:sSub>
+      </m:oMath>
+      <w:r>
+        <w:rPr>
+          <w:rFonts w:eastAsia="Times New Roman" w:cs="Times New Roman" w:cstheme="minorAscii" w:eastAsiaTheme="minorAscii" w:ascii="Liberation Serif" w:hAnsi="Liberation Serif"/>
+          <w:b w:val="false"/>
+          <w:bCs w:val="false"/>
+          <w:i w:val="false"/>
+          <w:iCs w:val="false"/>
+          <w:caps w:val="false"/>
+          <w:smallCaps w:val="false"/>
+          <w:sz w:val="24"/>
+          <w:szCs w:val="24"/>
+          <w:lang w:val="en-US"/>
+        </w:rPr>
+        <w:t xml:space="preserve"> </w:t>
+      </w:r>
+    </w:p>
+    <w:p>
+      <w:pPr>
+        <w:pStyle w:val="BodyText"/>
+        <w:spacing w:before="0" w:after="140"/>
+        <w:rPr>
+          <w:rFonts w:ascii="Liberation Serif" w:hAnsi="Liberation Serif" w:eastAsia="Times New Roman" w:cs="Times New Roman" w:cstheme="minorAscii" w:eastAsiaTheme="minorAscii"/>
+          <w:b w:val="false"/>
+          <w:bCs w:val="false"/>
+          <w:i w:val="false"/>
+          <w:iCs w:val="false"/>
+          <w:caps w:val="false"/>
+          <w:smallCaps w:val="false"/>
+          <w:sz w:val="24"/>
+          <w:szCs w:val="24"/>
+          <w:lang w:val="en-US"/>
+        </w:rPr>
+      </w:pPr>
+      <w:r>
+        <w:rPr>
+          <w:rFonts w:eastAsia="Times New Roman" w:cs="Times New Roman" w:cstheme="minorAscii" w:eastAsiaTheme="minorAscii" w:ascii="Liberation Serif" w:hAnsi="Liberation Serif"/>
+          <w:b w:val="false"/>
+          <w:bCs w:val="false"/>
+          <w:i w:val="false"/>
+          <w:iCs w:val="false"/>
+          <w:caps w:val="false"/>
+          <w:smallCaps w:val="false"/>
+          <w:sz w:val="24"/>
+          <w:szCs w:val="24"/>
+          <w:lang w:val="en-US"/>
+        </w:rPr>
+      </w:r>
+      <m:oMathPara xmlns:m="http://schemas.openxmlformats.org/officeDocument/2006/math">
+        <m:oMathParaPr>
+          <m:jc m:val="left"/>
+        </m:oMathParaPr>
+        <m:oMath>
+          <m:sSub>
+            <m:e>
+              <m:r>
+                <w:rPr>
+                  <w:rFonts w:ascii="Cambria Math" w:hAnsi="Cambria Math"/>
+                </w:rPr>
+                <m:t xml:space="preserve">H</m:t>
+              </m:r>
+            </m:e>
+            <m:sub>
+              <m:r>
+                <w:rPr>
+                  <w:rFonts w:ascii="Cambria Math" w:hAnsi="Cambria Math"/>
+                </w:rPr>
+                <m:t xml:space="preserve">S</m:t>
+              </m:r>
+            </m:sub>
+          </m:sSub>
+          <m:r>
+            <w:rPr>
+              <w:rFonts w:ascii="Cambria Math" w:hAnsi="Cambria Math"/>
+            </w:rPr>
+            <m:t xml:space="preserve">:</m:t>
+          </m:r>
+          <m:sSub>
+            <m:e>
+              <m:r>
+                <w:rPr>
+                  <w:rFonts w:ascii="Cambria Math" w:hAnsi="Cambria Math"/>
+                </w:rPr>
+                <m:t xml:space="preserve">μ</m:t>
+              </m:r>
+            </m:e>
+            <m:sub>
+              <m:r>
+                <w:rPr>
+                  <w:rFonts w:ascii="Cambria Math" w:hAnsi="Cambria Math"/>
+                </w:rPr>
+                <m:t xml:space="preserve">1</m:t>
+              </m:r>
+            </m:sub>
+          </m:sSub>
+          <m:r>
+            <w:rPr>
+              <w:rFonts w:ascii="Cambria Math" w:hAnsi="Cambria Math"/>
+            </w:rPr>
+            <m:t xml:space="preserve">≠</m:t>
+          </m:r>
+          <m:sSub>
+            <m:e>
+              <m:r>
+                <w:rPr>
+                  <w:rFonts w:ascii="Cambria Math" w:hAnsi="Cambria Math"/>
+                </w:rPr>
+                <m:t xml:space="preserve">μ</m:t>
+              </m:r>
+            </m:e>
+            <m:sub>
+              <m:r>
+                <w:rPr>
+                  <w:rFonts w:ascii="Cambria Math" w:hAnsi="Cambria Math"/>
+                </w:rPr>
+                <m:t xml:space="preserve">2</m:t>
+              </m:r>
+            </m:sub>
+          </m:sSub>
+        </m:oMath>
+      </m:oMathPara>
+    </w:p>
+    <w:p>
+      <w:pPr>
+        <w:pStyle w:val="BodyText"/>
+        <w:spacing w:before="0" w:after="140"/>
+        <w:rPr>
+          <w:rFonts w:ascii="Liberation Serif" w:hAnsi="Liberation Serif" w:eastAsia="Times New Roman" w:cs="Times New Roman" w:cstheme="minorAscii" w:eastAsiaTheme="minorAscii"/>
+          <w:b w:val="false"/>
+          <w:bCs w:val="false"/>
+          <w:i w:val="false"/>
+          <w:iCs w:val="false"/>
+          <w:caps w:val="false"/>
+          <w:smallCaps w:val="false"/>
+          <w:sz w:val="24"/>
+          <w:szCs w:val="24"/>
+          <w:lang w:val="en-US"/>
+        </w:rPr>
+      </w:pPr>
+      <w:r>
+        <w:rPr>
+          <w:rFonts w:eastAsia="Times New Roman" w:cs="Times New Roman" w:cstheme="minorAscii" w:eastAsiaTheme="minorAscii" w:ascii="Liberation Serif" w:hAnsi="Liberation Serif"/>
+          <w:b w:val="false"/>
+          <w:bCs w:val="false"/>
+          <w:i w:val="false"/>
+          <w:iCs w:val="false"/>
+          <w:caps w:val="false"/>
+          <w:smallCaps w:val="false"/>
+          <w:sz w:val="24"/>
+          <w:szCs w:val="24"/>
+          <w:lang w:val="en-US"/>
+        </w:rPr>
+        <w:drawing>
+          <wp:inline distT="0" distB="0" distL="0" distR="0">
+            <wp:extent cx="3009265" cy="381000"/>
+            <wp:effectExtent l="0" t="0" r="0" b="0"/>
+            <wp:docPr id="13" name="Görüntü14"/>
+            <wp:cNvGraphicFramePr>
+              <a:graphicFrameLocks xmlns:a="http://schemas.openxmlformats.org/drawingml/2006/main" noChangeAspect="1"/>
+            </wp:cNvGraphicFramePr>
+            <a:graphic xmlns:a="http://schemas.openxmlformats.org/drawingml/2006/main">
+              <a:graphicData uri="http://schemas.openxmlformats.org/drawingml/2006/picture">
+                <pic:pic xmlns:pic="http://schemas.openxmlformats.org/drawingml/2006/picture">
+                  <pic:nvPicPr>
+                    <pic:cNvPr id="13" name="Görüntü14"/>
+                    <pic:cNvPicPr>
+                      <a:picLocks noChangeAspect="1" noChangeArrowheads="1"/>
+                    </pic:cNvPicPr>
+                  </pic:nvPicPr>
+                  <pic:blipFill>
+                    <a:blip r:embed="rId16"/>
+                    <a:stretch>
+                      <a:fillRect/>
+                    </a:stretch>
+                  </pic:blipFill>
+                  <pic:spPr bwMode="auto">
+                    <a:xfrm>
+                      <a:off x="0" y="0"/>
+                      <a:ext cx="3009265" cy="381000"/>
+                    </a:xfrm>
+                    <a:prstGeom prst="rect">
+                      <a:avLst/>
+                    </a:prstGeom>
+                    <a:noFill/>
+                  </pic:spPr>
+                </pic:pic>
+              </a:graphicData>
+            </a:graphic>
+          </wp:inline>
+        </w:drawing>
+      </w:r>
+      <w:r>
+        <w:rPr>
+          <w:rFonts w:eastAsia="Times New Roman" w:cs="Times New Roman" w:cstheme="minorAscii" w:eastAsiaTheme="minorAscii" w:ascii="Liberation Serif" w:hAnsi="Liberation Serif"/>
+          <w:b w:val="false"/>
+          <w:bCs w:val="false"/>
+          <w:i w:val="false"/>
+          <w:iCs w:val="false"/>
+          <w:caps w:val="false"/>
+          <w:smallCaps w:val="false"/>
+          <w:sz w:val="24"/>
+          <w:szCs w:val="24"/>
+          <w:lang w:val="en-US"/>
+        </w:rPr>
+        <w:t xml:space="preserve"> </w:t>
+      </w:r>
+    </w:p>
+    <w:p>
+      <w:pPr>
+        <w:pStyle w:val="BodyText"/>
+        <w:spacing w:before="0" w:after="140"/>
+        <w:rPr>
+          <w:rFonts w:ascii="Liberation Serif" w:hAnsi="Liberation Serif" w:eastAsia="Times New Roman" w:cs="Times New Roman" w:cstheme="minorAscii" w:eastAsiaTheme="minorAscii"/>
+          <w:b w:val="false"/>
+          <w:bCs w:val="false"/>
+          <w:i w:val="false"/>
+          <w:iCs w:val="false"/>
+          <w:caps w:val="false"/>
+          <w:smallCaps w:val="false"/>
+          <w:sz w:val="24"/>
+          <w:szCs w:val="24"/>
+          <w:lang w:val="en-US"/>
+        </w:rPr>
+      </w:pPr>
+      <w:r>
+        <w:rPr>
+          <w:rFonts w:eastAsia="Times New Roman" w:cs="Times New Roman" w:cstheme="minorAscii" w:eastAsiaTheme="minorAscii" w:ascii="Liberation Serif" w:hAnsi="Liberation Serif"/>
+          <w:b w:val="false"/>
+          <w:bCs w:val="false"/>
+          <w:i w:val="false"/>
+          <w:iCs w:val="false"/>
+          <w:caps w:val="false"/>
+          <w:smallCaps w:val="false"/>
+          <w:sz w:val="24"/>
+          <w:szCs w:val="24"/>
+          <w:lang w:val="en-US"/>
+        </w:rPr>
+        <w:drawing>
+          <wp:inline distT="0" distB="0" distL="0" distR="0">
+            <wp:extent cx="2790190" cy="247015"/>
+            <wp:effectExtent l="0" t="0" r="0" b="0"/>
+            <wp:docPr id="14" name="Görüntü13"/>
+            <wp:cNvGraphicFramePr>
+              <a:graphicFrameLocks xmlns:a="http://schemas.openxmlformats.org/drawingml/2006/main" noChangeAspect="1"/>
+            </wp:cNvGraphicFramePr>
+            <a:graphic xmlns:a="http://schemas.openxmlformats.org/drawingml/2006/main">
+              <a:graphicData uri="http://schemas.openxmlformats.org/drawingml/2006/picture">
+                <pic:pic xmlns:pic="http://schemas.openxmlformats.org/drawingml/2006/picture">
+                  <pic:nvPicPr>
+                    <pic:cNvPr id="14" name="Görüntü13"/>
+                    <pic:cNvPicPr>
+                      <a:picLocks noChangeAspect="1" noChangeArrowheads="1"/>
+                    </pic:cNvPicPr>
+                  </pic:nvPicPr>
+                  <pic:blipFill>
+                    <a:blip r:embed="rId17"/>
+                    <a:stretch>
+                      <a:fillRect/>
+                    </a:stretch>
+                  </pic:blipFill>
+                  <pic:spPr bwMode="auto">
+                    <a:xfrm>
+                      <a:off x="0" y="0"/>
+                      <a:ext cx="2790190" cy="247015"/>
+                    </a:xfrm>
+                    <a:prstGeom prst="rect">
+                      <a:avLst/>
+                    </a:prstGeom>
+                    <a:noFill/>
+                  </pic:spPr>
+                </pic:pic>
+              </a:graphicData>
+            </a:graphic>
+          </wp:inline>
+        </w:drawing>
+      </w:r>
+    </w:p>
+    <w:p>
+      <w:pPr>
+        <w:pStyle w:val="BodyText"/>
+        <w:spacing w:before="0" w:after="140"/>
+        <w:rPr>
+          <w:rFonts w:ascii="Liberation Serif" w:hAnsi="Liberation Serif" w:eastAsia="Times New Roman" w:cs="Times New Roman" w:cstheme="minorAscii" w:eastAsiaTheme="minorAscii"/>
+          <w:b w:val="false"/>
+          <w:bCs w:val="false"/>
+          <w:i w:val="false"/>
+          <w:iCs w:val="false"/>
+          <w:caps w:val="false"/>
+          <w:smallCaps w:val="false"/>
+          <w:sz w:val="24"/>
+          <w:szCs w:val="24"/>
+          <w:lang w:val="en-US"/>
+        </w:rPr>
+      </w:pPr>
+      <w:r>
+        <w:rPr>
+          <w:rFonts w:eastAsia="Times New Roman" w:cs="Times New Roman" w:cstheme="minorAscii" w:eastAsiaTheme="minorAscii" w:ascii="Liberation Serif" w:hAnsi="Liberation Serif"/>
+          <w:b w:val="false"/>
+          <w:bCs w:val="false"/>
+          <w:i w:val="false"/>
+          <w:iCs w:val="false"/>
+          <w:caps w:val="false"/>
+          <w:smallCaps w:val="false"/>
+          <w:sz w:val="24"/>
+          <w:szCs w:val="24"/>
+          <w:lang w:val="en-US"/>
+        </w:rPr>
+        <w:drawing>
+          <wp:inline distT="0" distB="0" distL="0" distR="0">
+            <wp:extent cx="4819015" cy="1666240"/>
+            <wp:effectExtent l="0" t="0" r="0" b="0"/>
+            <wp:docPr id="15" name="Görüntü15"/>
+            <wp:cNvGraphicFramePr>
+              <a:graphicFrameLocks xmlns:a="http://schemas.openxmlformats.org/drawingml/2006/main" noChangeAspect="1"/>
+            </wp:cNvGraphicFramePr>
+            <a:graphic xmlns:a="http://schemas.openxmlformats.org/drawingml/2006/main">
+              <a:graphicData uri="http://schemas.openxmlformats.org/drawingml/2006/picture">
+                <pic:pic xmlns:pic="http://schemas.openxmlformats.org/drawingml/2006/picture">
+                  <pic:nvPicPr>
+                    <pic:cNvPr id="15" name="Görüntü15"/>
+                    <pic:cNvPicPr>
+                      <a:picLocks noChangeAspect="1" noChangeArrowheads="1"/>
+                    </pic:cNvPicPr>
+                  </pic:nvPicPr>
+                  <pic:blipFill>
+                    <a:blip r:embed="rId18"/>
+                    <a:stretch>
+                      <a:fillRect/>
+                    </a:stretch>
+                  </pic:blipFill>
+                  <pic:spPr bwMode="auto">
+                    <a:xfrm>
+                      <a:off x="0" y="0"/>
+                      <a:ext cx="4819015" cy="1666240"/>
+                    </a:xfrm>
+                    <a:prstGeom prst="rect">
+                      <a:avLst/>
+                    </a:prstGeom>
+                    <a:noFill/>
+                  </pic:spPr>
+                </pic:pic>
+              </a:graphicData>
+            </a:graphic>
+          </wp:inline>
+        </w:drawing>
+      </w:r>
+    </w:p>
+    <w:p>
+      <w:pPr>
+        <w:pStyle w:val="BodyText"/>
+        <w:spacing w:before="0" w:after="140"/>
+        <w:rPr>
+          <w:rFonts w:ascii="Liberation Serif" w:hAnsi="Liberation Serif" w:eastAsia="Times New Roman" w:cs="Times New Roman" w:cstheme="minorAscii" w:eastAsiaTheme="minorAscii"/>
+          <w:b w:val="false"/>
+          <w:bCs w:val="false"/>
+          <w:i w:val="false"/>
+          <w:iCs w:val="false"/>
+          <w:caps w:val="false"/>
+          <w:smallCaps w:val="false"/>
+          <w:sz w:val="24"/>
+          <w:szCs w:val="24"/>
+          <w:lang w:val="en-US"/>
+        </w:rPr>
+      </w:pPr>
+      <w:r>
+        <w:rPr>
+          <w:rFonts w:eastAsia="Times New Roman" w:cs="Times New Roman" w:cstheme="minorAscii" w:eastAsiaTheme="minorAscii" w:ascii="Liberation Serif" w:hAnsi="Liberation Serif"/>
+          <w:b w:val="false"/>
+          <w:bCs w:val="false"/>
+          <w:i w:val="false"/>
+          <w:iCs w:val="false"/>
+          <w:caps w:val="false"/>
+          <w:smallCaps w:val="false"/>
+          <w:sz w:val="24"/>
+          <w:szCs w:val="24"/>
+          <w:lang w:val="en-US"/>
+        </w:rPr>
+        <w:t>Gruplar öncelikle ayrılarak ilac1 ve ilac2 değişkenlerine atandı. t.test fonskiyonunda paired=TRUE parametresi ile bağımlı t testi yapıldı.</w:t>
+      </w:r>
+    </w:p>
+    <w:p>
+      <w:pPr>
+        <w:pStyle w:val="BodyText"/>
+        <w:spacing w:before="0" w:after="140"/>
+        <w:rPr>
+          <w:rFonts w:ascii="Liberation Serif" w:hAnsi="Liberation Serif" w:eastAsia="Times New Roman" w:cs="Times New Roman" w:cstheme="minorAscii" w:eastAsiaTheme="minorAscii"/>
+          <w:b w:val="false"/>
+          <w:bCs w:val="false"/>
+          <w:i w:val="false"/>
+          <w:iCs w:val="false"/>
+          <w:caps w:val="false"/>
+          <w:smallCaps w:val="false"/>
+          <w:sz w:val="24"/>
+          <w:szCs w:val="24"/>
+          <w:lang w:val="en-US"/>
+        </w:rPr>
+      </w:pPr>
+      <w:r>
+        <w:rPr>
+          <w:rFonts w:eastAsia="Times New Roman" w:cs="Times New Roman" w:cstheme="minorAscii" w:eastAsiaTheme="minorAscii" w:ascii="Liberation Serif" w:hAnsi="Liberation Serif"/>
+          <w:b w:val="false"/>
+          <w:bCs w:val="false"/>
+          <w:i w:val="false"/>
+          <w:iCs w:val="false"/>
+          <w:caps w:val="false"/>
+          <w:smallCaps w:val="false"/>
+          <w:sz w:val="24"/>
+          <w:szCs w:val="24"/>
+          <w:lang w:val="en-US"/>
+        </w:rPr>
+      </w:r>
+    </w:p>
+    <w:p>
+      <w:pPr>
+        <w:pStyle w:val="BodyText"/>
+        <w:spacing w:before="0" w:after="140"/>
+        <w:rPr>
+          <w:rFonts w:ascii="Liberation Serif" w:hAnsi="Liberation Serif" w:eastAsia="Times New Roman" w:cs="Times New Roman" w:cstheme="minorAscii" w:eastAsiaTheme="minorAscii"/>
+          <w:b/>
+          <w:bCs/>
+          <w:i w:val="false"/>
+          <w:iCs w:val="false"/>
+          <w:caps w:val="false"/>
+          <w:smallCaps w:val="false"/>
+          <w:sz w:val="28"/>
+          <w:szCs w:val="28"/>
+          <w:lang w:val="en-US"/>
+        </w:rPr>
+      </w:pPr>
+      <w:r>
+        <w:rPr>
+          <w:rFonts w:eastAsia="Times New Roman" w:cs="Times New Roman" w:cstheme="minorAscii" w:eastAsiaTheme="minorAscii" w:ascii="Liberation Serif" w:hAnsi="Liberation Serif"/>
+          <w:b/>
+          <w:bCs/>
+          <w:i w:val="false"/>
+          <w:iCs w:val="false"/>
+          <w:caps w:val="false"/>
+          <w:smallCaps w:val="false"/>
+          <w:sz w:val="28"/>
+          <w:szCs w:val="28"/>
+          <w:lang w:val="en-US"/>
+        </w:rPr>
+        <w:t>Bulgular ve Sonuç</w:t>
+      </w:r>
+    </w:p>
+    <w:p>
+      <w:pPr>
+        <w:pStyle w:val="BodyText"/>
+        <w:spacing w:before="0" w:after="140"/>
+        <w:rPr>
+          <w:rFonts w:ascii="Liberation Serif" w:hAnsi="Liberation Serif" w:eastAsia="Times New Roman" w:cs="Times New Roman" w:cstheme="minorAscii" w:eastAsiaTheme="minorAscii"/>
+          <w:b w:val="false"/>
+          <w:bCs w:val="false"/>
+          <w:i w:val="false"/>
+          <w:iCs w:val="false"/>
+          <w:caps w:val="false"/>
+          <w:smallCaps w:val="false"/>
+          <w:sz w:val="24"/>
+          <w:szCs w:val="24"/>
+          <w:lang w:val="en-US"/>
+        </w:rPr>
+      </w:pPr>
+      <w:r>
+        <w:rPr>
+          <w:rFonts w:eastAsia="Times New Roman" w:cs="Times New Roman" w:cstheme="minorAscii" w:eastAsiaTheme="minorAscii" w:ascii="Liberation Serif" w:hAnsi="Liberation Serif"/>
+          <w:b w:val="false"/>
+          <w:bCs w:val="false"/>
+          <w:i w:val="false"/>
+          <w:iCs w:val="false"/>
+          <w:caps w:val="false"/>
+          <w:smallCaps w:val="false"/>
+          <w:sz w:val="24"/>
+          <w:szCs w:val="24"/>
+          <w:lang w:val="en-US"/>
+        </w:rPr>
+        <w:t xml:space="preserve"> </w:t>
+      </w:r>
+      <w:r>
+        <w:rPr>
+          <w:rFonts w:eastAsia="Times New Roman" w:cs="Times New Roman" w:cstheme="minorAscii" w:eastAsiaTheme="minorAscii" w:ascii="Liberation Serif" w:hAnsi="Liberation Serif"/>
+          <w:b w:val="false"/>
+          <w:bCs w:val="false"/>
+          <w:i w:val="false"/>
+          <w:iCs w:val="false"/>
+          <w:caps w:val="false"/>
+          <w:smallCaps w:val="false"/>
+          <w:sz w:val="24"/>
+          <w:szCs w:val="24"/>
+          <w:lang w:val="en-US"/>
+        </w:rPr>
+        <w:t xml:space="preserve">p değeri 0.0028 olduğu görülmektedir. p değeri alfa değeri olan 0.05’ten daha küçük olduğundan dolayı </w:t>
+      </w:r>
+      <w:r>
+        <w:rPr>
+          <w:rFonts w:eastAsia="Times New Roman" w:cs="Times New Roman" w:cstheme="minorAscii" w:eastAsiaTheme="minorAscii" w:ascii="Liberation Serif" w:hAnsi="Liberation Serif"/>
+          <w:b w:val="false"/>
+          <w:bCs w:val="false"/>
+          <w:i w:val="false"/>
+          <w:iCs w:val="false"/>
+          <w:caps w:val="false"/>
+          <w:smallCaps w:val="false"/>
+          <w:sz w:val="24"/>
+          <w:szCs w:val="24"/>
+          <w:lang w:val="en-US"/>
+        </w:rPr>
+      </w:r>
+      <m:oMath xmlns:m="http://schemas.openxmlformats.org/officeDocument/2006/math">
+        <m:sSub>
+          <m:e>
+            <m:r>
+              <w:rPr>
+                <w:rFonts w:ascii="Cambria Math" w:hAnsi="Cambria Math"/>
+              </w:rPr>
+              <m:t xml:space="preserve">H</m:t>
+            </m:r>
+          </m:e>
+          <m:sub>
+            <m:r>
+              <w:rPr>
+                <w:rFonts w:ascii="Cambria Math" w:hAnsi="Cambria Math"/>
+              </w:rPr>
+              <m:t xml:space="preserve">0</m:t>
+            </m:r>
+          </m:sub>
+        </m:sSub>
+      </m:oMath>
+      <w:r>
+        <w:rPr>
+          <w:rFonts w:eastAsia="Times New Roman" w:cs="Times New Roman" w:cstheme="minorAscii" w:eastAsiaTheme="minorAscii" w:ascii="Liberation Serif" w:hAnsi="Liberation Serif"/>
+          <w:b w:val="false"/>
+          <w:bCs w:val="false"/>
+          <w:i w:val="false"/>
+          <w:iCs w:val="false"/>
+          <w:caps w:val="false"/>
+          <w:smallCaps w:val="false"/>
+          <w:sz w:val="24"/>
+          <w:szCs w:val="24"/>
+          <w:lang w:val="en-US"/>
+        </w:rPr>
+        <w:t xml:space="preserve"> hipotezi reddedilir. Güven aralığı yorumlanacak olursa; alt sınır -2.4598, üst sınır ise -0.7001’dir. 0 değeri bu aralıkta yer almadığı için </w:t>
+      </w:r>
+      <w:r>
+        <w:rPr>
+          <w:rFonts w:eastAsia="Times New Roman" w:cs="Times New Roman" w:cstheme="minorAscii" w:eastAsiaTheme="minorAscii" w:ascii="Liberation Serif" w:hAnsi="Liberation Serif"/>
+          <w:b w:val="false"/>
+          <w:bCs w:val="false"/>
+          <w:i w:val="false"/>
+          <w:iCs w:val="false"/>
+          <w:caps w:val="false"/>
+          <w:smallCaps w:val="false"/>
+          <w:sz w:val="24"/>
+          <w:szCs w:val="24"/>
+          <w:lang w:val="en-US"/>
+        </w:rPr>
+      </w:r>
+      <m:oMath xmlns:m="http://schemas.openxmlformats.org/officeDocument/2006/math">
+        <m:sSub>
+          <m:e>
+            <m:r>
+              <w:rPr>
+                <w:rFonts w:ascii="Cambria Math" w:hAnsi="Cambria Math"/>
+              </w:rPr>
+              <m:t xml:space="preserve">H</m:t>
+            </m:r>
+          </m:e>
+          <m:sub>
+            <m:r>
+              <w:rPr>
+                <w:rFonts w:ascii="Cambria Math" w:hAnsi="Cambria Math"/>
+              </w:rPr>
+              <m:t xml:space="preserve">0</m:t>
+            </m:r>
+          </m:sub>
+        </m:sSub>
+      </m:oMath>
+      <w:r>
+        <w:rPr>
+          <w:rFonts w:eastAsia="Times New Roman" w:cs="Times New Roman" w:cstheme="minorAscii" w:eastAsiaTheme="minorAscii" w:ascii="Liberation Serif" w:hAnsi="Liberation Serif"/>
+          <w:b w:val="false"/>
+          <w:bCs w:val="false"/>
+          <w:i w:val="false"/>
+          <w:iCs w:val="false"/>
+          <w:caps w:val="false"/>
+          <w:smallCaps w:val="false"/>
+          <w:sz w:val="24"/>
+          <w:szCs w:val="24"/>
+          <w:lang w:val="en-US"/>
+        </w:rPr>
+        <w:t xml:space="preserve"> hipotezi reddedilir. Sonuç olarak %95 güven düzeyinde ilaçlar arasında fark vardır, 2.ilacı aldıktan sonra uyku süresindeki </w:t>
+      </w:r>
+      <w:r>
+        <w:rPr>
+          <w:rFonts w:eastAsia="Times New Roman" w:cs="Times New Roman" w:cstheme="minorAscii" w:eastAsiaTheme="minorAscii" w:ascii="Liberation Serif" w:hAnsi="Liberation Serif"/>
+          <w:b w:val="false"/>
+          <w:bCs w:val="false"/>
+          <w:i w:val="false"/>
+          <w:iCs w:val="false"/>
+          <w:caps w:val="false"/>
+          <w:smallCaps w:val="false"/>
+          <w:sz w:val="24"/>
+          <w:szCs w:val="24"/>
+          <w:lang w:val="en-US"/>
+        </w:rPr>
+        <w:t>artış miktarı</w:t>
+      </w:r>
+      <w:r>
+        <w:rPr>
+          <w:rFonts w:eastAsia="Times New Roman" w:cs="Times New Roman" w:cstheme="minorAscii" w:eastAsiaTheme="minorAscii" w:ascii="Liberation Serif" w:hAnsi="Liberation Serif"/>
+          <w:b w:val="false"/>
+          <w:bCs w:val="false"/>
+          <w:i w:val="false"/>
+          <w:iCs w:val="false"/>
+          <w:caps w:val="false"/>
+          <w:smallCaps w:val="false"/>
+          <w:sz w:val="24"/>
+          <w:szCs w:val="24"/>
+          <w:lang w:val="en-US"/>
+        </w:rPr>
+        <w:t xml:space="preserve"> 1.ilaca göre farklılık gösterdiğini söyleyebiliriz.</w:t>
+      </w:r>
+    </w:p>
+    <w:p>
+      <w:pPr>
+        <w:pStyle w:val="Heading1"/>
+        <w:rPr>
+          <w:rFonts w:ascii="Liberation Serif" w:hAnsi="Liberation Serif"/>
+        </w:rPr>
+      </w:pPr>
+      <w:r>
+        <w:rPr>
+          <w:rFonts w:ascii="Liberation Serif" w:hAnsi="Liberation Serif"/>
+        </w:rPr>
+        <w:t>2.Uyum İyiliği Testi, Gruplar Arası Fark ve Bağımsızlık Kontrolü</w:t>
+      </w:r>
+    </w:p>
+    <w:p>
+      <w:pPr>
+        <w:pStyle w:val="Normal"/>
+        <w:spacing w:lineRule="auto" w:line="240"/>
+        <w:ind w:hanging="0" w:left="0"/>
+        <w:rPr>
+          <w:rFonts w:ascii="Liberation Serif" w:hAnsi="Liberation Serif"/>
+        </w:rPr>
+      </w:pPr>
+      <w:r>
+        <w:rPr>
+          <w:rFonts w:ascii="Liberation Serif" w:hAnsi="Liberation Serif"/>
+        </w:rPr>
+        <w:tab/>
+        <w:t>Bu başlık altında veri setleri üzerinde Ki-kare çözümlemesinde verilen; uyum iyiliği testi, gruplar arası fark ve bağımsızlık kontrolüne ilişkin çözümleri ya</w:t>
+      </w:r>
+      <w:r>
+        <w:rPr>
+          <w:rFonts w:ascii="Liberation Serif" w:hAnsi="Liberation Serif"/>
+        </w:rPr>
+        <w:t>pılacaktır.</w:t>
+      </w:r>
+    </w:p>
+    <w:p>
+      <w:pPr>
+        <w:pStyle w:val="Heading2"/>
+        <w:numPr>
+          <w:ilvl w:val="1"/>
+          <w:numId w:val="2"/>
+        </w:numPr>
+        <w:ind w:hanging="0" w:left="0"/>
+        <w:rPr>
+          <w:rFonts w:ascii="Liberation Serif" w:hAnsi="Liberation Serif"/>
+        </w:rPr>
+      </w:pPr>
+      <w:r>
+        <w:rPr>
+          <w:rFonts w:ascii="Liberation Serif" w:hAnsi="Liberation Serif"/>
+        </w:rPr>
+        <w:t>2.1 Uyum İyiliği Testi</w:t>
+      </w:r>
+    </w:p>
+    <w:p>
+      <w:pPr>
+        <w:pStyle w:val="BodyText"/>
+        <w:spacing w:before="0" w:after="140"/>
+        <w:rPr>
+          <w:rFonts w:ascii="Liberation Serif" w:hAnsi="Liberation Serif"/>
+        </w:rPr>
+      </w:pPr>
+      <w:r>
+        <w:rPr>
+          <w:rFonts w:ascii="Liberation Serif" w:hAnsi="Liberation Serif"/>
+        </w:rPr>
+        <w:tab/>
       </w:r>
     </w:p>
     <w:sectPr>
@@ -2707,6 +5262,7 @@
     <w:lvl w:ilvl="3">
       <w:start w:val="1"/>
       <w:numFmt w:val="none"/>
+      <w:pStyle w:val="Heading4"/>
       <w:suff w:val="nothing"/>
       <w:lvlText w:val=""/>
       <w:lvlJc w:val="left"/>
@@ -3389,6 +5945,28 @@
       <w:szCs w:val="28"/>
     </w:rPr>
   </w:style>
+  <w:style w:type="paragraph" w:styleId="Heading4">
+    <w:name w:val="heading 4"/>
+    <w:basedOn w:val="Balk"/>
+    <w:next w:val="BodyText"/>
+    <w:qFormat/>
+    <w:pPr>
+      <w:numPr>
+        <w:ilvl w:val="3"/>
+        <w:numId w:val="1"/>
+      </w:numPr>
+      <w:spacing w:before="120" w:after="120"/>
+      <w:outlineLvl w:val="3"/>
+    </w:pPr>
+    <w:rPr>
+      <w:b/>
+      <w:bCs/>
+      <w:i/>
+      <w:iCs/>
+      <w:sz w:val="26"/>
+      <w:szCs w:val="26"/>
+    </w:rPr>
+  </w:style>
   <w:style w:type="character" w:styleId="DefaultParagraphFont" w:default="1">
     <w:name w:val="Default Paragraph Font"/>
     <w:uiPriority w:val="1"/>

</xml_diff>